<commit_message>
Add executive scorecard and integrate it into the master documentation pack.
Includes a leadership-facing one-page TDLC summary, updated resource indexing, and regenerated Word export to keep markdown and docx artifacts in sync.

Made-with: Cursor
</commit_message>
<xml_diff>
--- a/docs/MASTER_DOCUMENTATION.docx
+++ b/docs/MASTER_DOCUMENTATION.docx
@@ -107,6 +107,16 @@
         <w:t xml:space="preserve">   - Filled Cursor matrix for attached TDLC capability/task evaluation sheets.</w:t>
       </w:r>
     </w:p>
+    <w:p>
+      <w:r>
+        <w:t>7. `docs/EXECUTIVE_SCORECARD.md`</w:t>
+      </w:r>
+    </w:p>
+    <w:p>
+      <w:r>
+        <w:t xml:space="preserve">   - Presentation-ready one-page leadership summary of Cursor TDLC performance.</w:t>
+      </w:r>
+    </w:p>
     <w:p/>
     <w:p>
       <w:pPr>
@@ -638,6 +648,14 @@
         <w:t>`docs/CURSOR_TDLC_METRICS_FILLED.md` - Filled Cursor-specific TDLC metrics from attached matrix.</w:t>
       </w:r>
     </w:p>
+    <w:p>
+      <w:pPr>
+        <w:pStyle w:val="ListBullet"/>
+      </w:pPr>
+      <w:r>
+        <w:t>`docs/EXECUTIVE_SCORECARD.md` - Executive one-page scorecard for leadership review.</w:t>
+      </w:r>
+    </w:p>
     <w:p/>
     <w:p>
       <w:pPr>
@@ -2952,6 +2970,277 @@
       </w:pPr>
       <w:r>
         <w:t>Deployment/Exchange/Design documentation scores are high due to completed and verified outcomes.</w:t>
+      </w:r>
+    </w:p>
+    <w:p>
+      <w:pPr>
+        <w:pStyle w:val="Heading1"/>
+      </w:pPr>
+      <w:r>
+        <w:t>Executive Scorecard</w:t>
+      </w:r>
+    </w:p>
+    <w:p>
+      <w:pPr>
+        <w:pStyle w:val="Heading1"/>
+      </w:pPr>
+      <w:r>
+        <w:t>Executive Scorecard - Cursor TDLC Performance</w:t>
+      </w:r>
+    </w:p>
+    <w:p/>
+    <w:p>
+      <w:pPr>
+        <w:pStyle w:val="Heading2"/>
+      </w:pPr>
+      <w:r>
+        <w:t>1) Overall Assessment</w:t>
+      </w:r>
+    </w:p>
+    <w:p/>
+    <w:p>
+      <w:r>
+        <w:t>| Dimension | Outcome |</w:t>
+      </w:r>
+    </w:p>
+    <w:p>
+      <w:r>
+        <w:t>|---|---|</w:t>
+      </w:r>
+    </w:p>
+    <w:p>
+      <w:r>
+        <w:t>| Delivery Completion | Strong end-to-end completion for build, deploy, documentation, and platform publication |</w:t>
+      </w:r>
+    </w:p>
+    <w:p>
+      <w:r>
+        <w:t>| Production Readiness | High for core app runtime, scheduler operations, and API/service functionality |</w:t>
+      </w:r>
+    </w:p>
+    <w:p>
+      <w:r>
+        <w:t>| Governance Readiness | Moderate; APIM registration stabilization intentionally deferred |</w:t>
+      </w:r>
+    </w:p>
+    <w:p>
+      <w:r>
+        <w:t>| Documentation Completeness | High; HLD, LLD, lifecycle, resource index, prompt ledger, and metrics complete |</w:t>
+      </w:r>
+    </w:p>
+    <w:p>
+      <w:r>
+        <w:t>| Operational Confidence | High for CloudHub runtime stability and periodic scheduler health checks |</w:t>
+      </w:r>
+    </w:p>
+    <w:p/>
+    <w:p>
+      <w:pPr>
+        <w:pStyle w:val="Heading2"/>
+      </w:pPr>
+      <w:r>
+        <w:t>2) Cursor Capability Snapshot (0-4 Scale)</w:t>
+      </w:r>
+    </w:p>
+    <w:p/>
+    <w:p>
+      <w:r>
+        <w:t>| Capability Area | Score | Executive Note |</w:t>
+      </w:r>
+    </w:p>
+    <w:p>
+      <w:r>
+        <w:t>|---|---:|---|</w:t>
+      </w:r>
+    </w:p>
+    <w:p>
+      <w:r>
+        <w:t>| Requirement to Feature Translation | 4 | Converted broad asks to executable phases with minimal back-and-forth |</w:t>
+      </w:r>
+    </w:p>
+    <w:p>
+      <w:r>
+        <w:t>| Design Documentation Generation | 4 | Produced functional + technical design documentation with architecture views |</w:t>
+      </w:r>
+    </w:p>
+    <w:p>
+      <w:r>
+        <w:t>| Build and Implementation | 4 | Delivered Mule flows, DW logic, scripts, and environment-specific configuration |</w:t>
+      </w:r>
+    </w:p>
+    <w:p>
+      <w:r>
+        <w:t>| Test Scenario Generation | 3 | Strong functional validation; MUnit automation impacted by repository/auth constraints |</w:t>
+      </w:r>
+    </w:p>
+    <w:p>
+      <w:r>
+        <w:t>| Deployment Execution | 4 | Repeated successful CloudHub2 deployments with runtime verification |</w:t>
+      </w:r>
+    </w:p>
+    <w:p>
+      <w:r>
+        <w:t>| Exchange and Design Center Operations | 4 | RAML synced to Design Center and published to Exchange |</w:t>
+      </w:r>
+    </w:p>
+    <w:p>
+      <w:r>
+        <w:t>| API Manager and Runtime Operations | 3 | Runtime operations strong; APIM registration requires separate stabilization stream |</w:t>
+      </w:r>
+    </w:p>
+    <w:p/>
+    <w:p>
+      <w:pPr>
+        <w:pStyle w:val="Heading2"/>
+      </w:pPr>
+      <w:r>
+        <w:t>3) Task-Level Score Highlights (1-10 Scale)</w:t>
+      </w:r>
+    </w:p>
+    <w:p/>
+    <w:p>
+      <w:r>
+        <w:t>| Task Cluster | Cursor Score | Effort Reduction | Leadership Summary |</w:t>
+      </w:r>
+    </w:p>
+    <w:p>
+      <w:r>
+        <w:t>|---|---:|---:|---|</w:t>
+      </w:r>
+    </w:p>
+    <w:p>
+      <w:r>
+        <w:t>| Requirements and Design | 8.5 | 45-55% | Clear gain in converting intent to architecture and implementation artifacts |</w:t>
+      </w:r>
+    </w:p>
+    <w:p>
+      <w:r>
+        <w:t>| API and Mule Build Tasks | 8.0 | 40-50% | Strong acceleration in flow development, error handling, and DW implementation |</w:t>
+      </w:r>
+    </w:p>
+    <w:p>
+      <w:r>
+        <w:t>| Testing and Validation | 7.0 | 20-55% | Functional and Postman coverage strong; MUnit maturity constrained by environment |</w:t>
+      </w:r>
+    </w:p>
+    <w:p>
+      <w:r>
+        <w:t>| Deployment and Runtime Ops | 8.5 | 40-50% | Reliable deployment + log-based verification loop |</w:t>
+      </w:r>
+    </w:p>
+    <w:p>
+      <w:r>
+        <w:t>| Platform/Governance | 7.0 | 20-55% | Excellent Exchange operations; APIM stabilization remains targeted follow-up item |</w:t>
+      </w:r>
+    </w:p>
+    <w:p/>
+    <w:p>
+      <w:pPr>
+        <w:pStyle w:val="Heading2"/>
+      </w:pPr>
+      <w:r>
+        <w:t>4) Delivery KPIs from This Engagement</w:t>
+      </w:r>
+    </w:p>
+    <w:p/>
+    <w:p>
+      <w:r>
+        <w:t>| KPI | Result |</w:t>
+      </w:r>
+    </w:p>
+    <w:p>
+      <w:r>
+        <w:t>|---|---|</w:t>
+      </w:r>
+    </w:p>
+    <w:p>
+      <w:r>
+        <w:t>| Actual App Runtime | `american-airlines-info-app-dev` running on CloudHub 2.0 |</w:t>
+      </w:r>
+    </w:p>
+    <w:p>
+      <w:r>
+        <w:t>| Scheduler Validation | Recurring heartbeat success logs observed over multiple intervals |</w:t>
+      </w:r>
+    </w:p>
+    <w:p>
+      <w:r>
+        <w:t>| DW Endpoint Validation | `/dw/simple`, `/dw/complex`, `/dw/multi1`, `/dw/multi2` validated with correct payloads |</w:t>
+      </w:r>
+    </w:p>
+    <w:p>
+      <w:r>
+        <w:t>| Design Center Sync | Completed (`american-airlines-info-api`) |</w:t>
+      </w:r>
+    </w:p>
+    <w:p>
+      <w:r>
+        <w:t>| Exchange Publish | Completed (`american-airlines-info-api:1.0.1`) |</w:t>
+      </w:r>
+    </w:p>
+    <w:p>
+      <w:r>
+        <w:t>| Documentation Pack | Completed (Markdown + consolidated `.docx`) |</w:t>
+      </w:r>
+    </w:p>
+    <w:p>
+      <w:r>
+        <w:t>| GitHub Push | Completed to target repository |</w:t>
+      </w:r>
+    </w:p>
+    <w:p/>
+    <w:p>
+      <w:pPr>
+        <w:pStyle w:val="Heading2"/>
+      </w:pPr>
+      <w:r>
+        <w:t>5) Risks and Follow-up Recommendations</w:t>
+      </w:r>
+    </w:p>
+    <w:p/>
+    <w:p>
+      <w:r>
+        <w:t>| Priority | Item | Recommendation |</w:t>
+      </w:r>
+    </w:p>
+    <w:p>
+      <w:r>
+        <w:t>|---|---|---|</w:t>
+      </w:r>
+    </w:p>
+    <w:p>
+      <w:r>
+        <w:t>| High | APIM registration remains unregistered | Run dedicated APIM stabilization sprint with control-plane handshake trace and policy replay |</w:t>
+      </w:r>
+    </w:p>
+    <w:p>
+      <w:r>
+        <w:t>| Medium | MUnit execution variability due repo/auth | Standardize enterprise Maven credential path and CI secret handling |</w:t>
+      </w:r>
+    </w:p>
+    <w:p>
+      <w:r>
+        <w:t>| Medium | Long Windows path handling in nested RAML modules | Keep exchange module paths excluded from git where non-essential; package through publish script |</w:t>
+      </w:r>
+    </w:p>
+    <w:p>
+      <w:r>
+        <w:t>| Low | Documentation refresh drift over future changes | Re-run `scripts/generate-doc-pack.py` as release checklist step |</w:t>
+      </w:r>
+    </w:p>
+    <w:p/>
+    <w:p>
+      <w:pPr>
+        <w:pStyle w:val="Heading2"/>
+      </w:pPr>
+      <w:r>
+        <w:t>6) Executive Conclusion</w:t>
+      </w:r>
+    </w:p>
+    <w:p/>
+    <w:p>
+      <w:r>
+        <w:t>Cursor delivered substantial acceleration across the Mule TDLC lifecycle, especially in build, deployment, runtime operations, and documentation. The project is operationally stable for the actual application and highly documented for handoff. The only significant deferred stream is API Manager registration stabilization, which is isolated and can be tackled as a targeted next phase without blocking current runtime service operations.</w:t>
       </w:r>
     </w:p>
     <w:sectPr>

</xml_diff>

<commit_message>
Add Postman CloudHub/local environments and expand diagram-first documentation for error handling and flight management.
Updates HLD and Exchange docs with additional Mermaid diagrams, refreshes documentation indexes, republishes Exchange home content, and regenerates the Word pack.

Made-with: Cursor
</commit_message>
<xml_diff>
--- a/docs/MASTER_DOCUMENTATION.docx
+++ b/docs/MASTER_DOCUMENTATION.docx
@@ -123,6 +123,112 @@
         <w:pStyle w:val="Heading2"/>
       </w:pPr>
       <w:r>
+        <w:t>Postman Playbook</w:t>
+      </w:r>
+    </w:p>
+    <w:p/>
+    <w:p>
+      <w:pPr>
+        <w:pStyle w:val="ListBullet"/>
+      </w:pPr>
+      <w:r>
+        <w:t>Primary import-ready collection:</w:t>
+      </w:r>
+    </w:p>
+    <w:p>
+      <w:r>
+        <w:t xml:space="preserve">  - `postman/american-airlines-info-api-playground.postman_collection.json`</w:t>
+      </w:r>
+    </w:p>
+    <w:p>
+      <w:pPr>
+        <w:pStyle w:val="ListBullet"/>
+      </w:pPr>
+      <w:r>
+        <w:t>Environments:</w:t>
+      </w:r>
+    </w:p>
+    <w:p>
+      <w:r>
+        <w:t xml:space="preserve">  - `postman/american-airlines-info-api-cloudhub.postman_environment.json`</w:t>
+      </w:r>
+    </w:p>
+    <w:p>
+      <w:r>
+        <w:t xml:space="preserve">  - `postman/american-airlines-info-api-local.postman_environment.json`</w:t>
+      </w:r>
+    </w:p>
+    <w:p>
+      <w:pPr>
+        <w:pStyle w:val="ListBullet"/>
+      </w:pPr>
+      <w:r>
+        <w:t>Alternate collections:</w:t>
+      </w:r>
+    </w:p>
+    <w:p>
+      <w:r>
+        <w:t xml:space="preserve">  - `postman/american-airlines-info-api-cloudhub.postman_collection.json`</w:t>
+      </w:r>
+    </w:p>
+    <w:p>
+      <w:r>
+        <w:t xml:space="preserve">  - `postman/american-airlines-info-api.postman_collection.json`</w:t>
+      </w:r>
+    </w:p>
+    <w:p/>
+    <w:p>
+      <w:r>
+        <w:t>Each request includes purpose-oriented naming and descriptive usage text.</w:t>
+      </w:r>
+    </w:p>
+    <w:p/>
+    <w:p>
+      <w:pPr>
+        <w:pStyle w:val="Heading2"/>
+      </w:pPr>
+      <w:r>
+        <w:t>Exchange Documentation Publication</w:t>
+      </w:r>
+    </w:p>
+    <w:p/>
+    <w:p>
+      <w:pPr>
+        <w:pStyle w:val="ListBullet"/>
+      </w:pPr>
+      <w:r>
+        <w:t>Source markdown:</w:t>
+      </w:r>
+    </w:p>
+    <w:p>
+      <w:r>
+        <w:t xml:space="preserve">  - `exchange-docs/home.md`</w:t>
+      </w:r>
+    </w:p>
+    <w:p>
+      <w:pPr>
+        <w:pStyle w:val="ListBullet"/>
+      </w:pPr>
+      <w:r>
+        <w:t>Publish path used:</w:t>
+      </w:r>
+    </w:p>
+    <w:p>
+      <w:r>
+        <w:t xml:space="preserve">  1. Update Exchange draft page `home`</w:t>
+      </w:r>
+    </w:p>
+    <w:p>
+      <w:r>
+        <w:t xml:space="preserve">  2. Publish asset documentation state</w:t>
+      </w:r>
+    </w:p>
+    <w:p/>
+    <w:p>
+      <w:pPr>
+        <w:pStyle w:val="Heading2"/>
+      </w:pPr>
+      <w:r>
         <w:t>Operational Verification Snapshot</w:t>
       </w:r>
     </w:p>
@@ -191,6 +297,14 @@
         <w:t>`docs/MASTER_DOCUMENTATION.docx`</w:t>
       </w:r>
     </w:p>
+    <w:p>
+      <w:pPr>
+        <w:pStyle w:val="ListBullet"/>
+      </w:pPr>
+      <w:r>
+        <w:t>`docs/MASTER_DOCUMENTATION_latest.docx` (lock-safe latest export)</w:t>
+      </w:r>
+    </w:p>
     <w:p/>
     <w:p>
       <w:r>
@@ -548,6 +662,30 @@
         <w:t>`postman/american-airlines-info-api-cloudhub.postman_collection.json` - CloudHub Postman collection.</w:t>
       </w:r>
     </w:p>
+    <w:p>
+      <w:pPr>
+        <w:pStyle w:val="ListBullet"/>
+      </w:pPr>
+      <w:r>
+        <w:t>`postman/american-airlines-info-api-playground.postman_collection.json` - Import-ready, purpose-driven collection with descriptive naming for all services.</w:t>
+      </w:r>
+    </w:p>
+    <w:p>
+      <w:pPr>
+        <w:pStyle w:val="ListBullet"/>
+      </w:pPr>
+      <w:r>
+        <w:t>`postman/american-airlines-info-api-cloudhub.postman_environment.json` - CloudHub environment variables for one-click execution.</w:t>
+      </w:r>
+    </w:p>
+    <w:p>
+      <w:pPr>
+        <w:pStyle w:val="ListBullet"/>
+      </w:pPr>
+      <w:r>
+        <w:t>`postman/american-airlines-info-api-local.postman_environment.json` - Local environment variables (`localhost`) for quick testing.</w:t>
+      </w:r>
+    </w:p>
     <w:p/>
     <w:p>
       <w:pPr>
@@ -656,13 +794,21 @@
         <w:t>`docs/EXECUTIVE_SCORECARD.md` - Executive one-page scorecard for leadership review.</w:t>
       </w:r>
     </w:p>
+    <w:p>
+      <w:pPr>
+        <w:pStyle w:val="ListBullet"/>
+      </w:pPr>
+      <w:r>
+        <w:t>`docs/MASTER_DOCUMENTATION_latest.docx` - Latest lock-safe Word export of full documentation pack.</w:t>
+      </w:r>
+    </w:p>
     <w:p/>
     <w:p>
       <w:pPr>
         <w:pStyle w:val="Heading2"/>
       </w:pPr>
       <w:r>
-        <w:t>10) Runtime-Only Local Investigation Artifacts</w:t>
+        <w:t>10) Exchange Publication and Documentation Operations</w:t>
       </w:r>
     </w:p>
     <w:p/>
@@ -671,6 +817,60 @@
         <w:pStyle w:val="ListBullet"/>
       </w:pPr>
       <w:r>
+        <w:t>API spec publish script:</w:t>
+      </w:r>
+    </w:p>
+    <w:p>
+      <w:r>
+        <w:t xml:space="preserve">  - `scripts/publish-api-spec.ps1`</w:t>
+      </w:r>
+    </w:p>
+    <w:p>
+      <w:pPr>
+        <w:pStyle w:val="ListBullet"/>
+      </w:pPr>
+      <w:r>
+        <w:t>Exchange home-page content source:</w:t>
+      </w:r>
+    </w:p>
+    <w:p>
+      <w:r>
+        <w:t xml:space="preserve">  - `exchange-docs/home.md`</w:t>
+      </w:r>
+    </w:p>
+    <w:p>
+      <w:pPr>
+        <w:pStyle w:val="ListBullet"/>
+      </w:pPr>
+      <w:r>
+        <w:t>Exchange home-page publish (API flow):</w:t>
+      </w:r>
+    </w:p>
+    <w:p>
+      <w:r>
+        <w:t xml:space="preserve">  - `PUT /exchange/api/v1/assets/{groupId}/{assetId}/{version}/draft/pages/home`</w:t>
+      </w:r>
+    </w:p>
+    <w:p>
+      <w:r>
+        <w:t xml:space="preserve">  - `PATCH /exchange/api/v1/assets/{groupId}/{assetId}/{version}`</w:t>
+      </w:r>
+    </w:p>
+    <w:p/>
+    <w:p>
+      <w:pPr>
+        <w:pStyle w:val="Heading2"/>
+      </w:pPr>
+      <w:r>
+        <w:t>11) Runtime-Only Local Investigation Artifacts</w:t>
+      </w:r>
+    </w:p>
+    <w:p/>
+    <w:p>
+      <w:pPr>
+        <w:pStyle w:val="ListBullet"/>
+      </w:pPr>
+      <w:r>
         <w:t>`ch2-logs*/` - CloudHub log downloads used for troubleshooting and verification.</w:t>
       </w:r>
     </w:p>
@@ -685,7 +885,7 @@
         <w:pStyle w:val="Heading2"/>
       </w:pPr>
       <w:r>
-        <w:t>11) Current Operational State Snapshot</w:t>
+        <w:t>12) Current Operational State Snapshot</w:t>
       </w:r>
     </w:p>
     <w:p/>
@@ -751,6 +951,55 @@
         <w:pStyle w:val="Heading2"/>
       </w:pPr>
       <w:r>
+        <w:t>Documentation Status</w:t>
+      </w:r>
+    </w:p>
+    <w:p/>
+    <w:p>
+      <w:pPr>
+        <w:pStyle w:val="ListBullet"/>
+      </w:pPr>
+      <w:r>
+        <w:t>This `home.md` content is the Exchange home-page source for asset:</w:t>
+      </w:r>
+    </w:p>
+    <w:p>
+      <w:r>
+        <w:t xml:space="preserve">  - `ad084e57-f62a-4ad8-876a-fa4bf9f3f7ce / american-airlines-info-api / 1.0.1`</w:t>
+      </w:r>
+    </w:p>
+    <w:p>
+      <w:pPr>
+        <w:pStyle w:val="ListBullet"/>
+      </w:pPr>
+      <w:r>
+        <w:t>Publication workflow used:</w:t>
+      </w:r>
+    </w:p>
+    <w:p>
+      <w:r>
+        <w:t xml:space="preserve">  1. Update draft page `home`</w:t>
+      </w:r>
+    </w:p>
+    <w:p>
+      <w:r>
+        <w:t xml:space="preserve">  2. Publish asset documentation state</w:t>
+      </w:r>
+    </w:p>
+    <w:p>
+      <w:pPr>
+        <w:pStyle w:val="ListBullet"/>
+      </w:pPr>
+      <w:r>
+        <w:t>Supporting docs are available in repository under `docs/` and Word package `docs/MASTER_DOCUMENTATION.docx`.</w:t>
+      </w:r>
+    </w:p>
+    <w:p/>
+    <w:p>
+      <w:pPr>
+        <w:pStyle w:val="Heading2"/>
+      </w:pPr>
+      <w:r>
         <w:t>Functional Scope</w:t>
       </w:r>
     </w:p>
@@ -984,6 +1233,300 @@
         <w:t>```</w:t>
       </w:r>
     </w:p>
+    <w:p/>
+    <w:p>
+      <w:pPr>
+        <w:pStyle w:val="Heading2"/>
+      </w:pPr>
+      <w:r>
+        <w:t>Workflow Diagram (Service-Level)</w:t>
+      </w:r>
+    </w:p>
+    <w:p/>
+    <w:p>
+      <w:r>
+        <w:t>```mermaid</w:t>
+      </w:r>
+    </w:p>
+    <w:p>
+      <w:r>
+        <w:t>flowchart TB</w:t>
+      </w:r>
+    </w:p>
+    <w:p>
+      <w:r>
+        <w:t xml:space="preserve">    Req[Incoming Request] --&gt; Router[APIKit Router]</w:t>
+      </w:r>
+    </w:p>
+    <w:p>
+      <w:r>
+        <w:t xml:space="preserve">    Router --&gt; CRUD[CRUD Implementation Flows]</w:t>
+      </w:r>
+    </w:p>
+    <w:p>
+      <w:r>
+        <w:t xml:space="preserve">    Router --&gt; Batch[Batch Flow]</w:t>
+      </w:r>
+    </w:p>
+    <w:p>
+      <w:r>
+        <w:t xml:space="preserve">    Router --&gt; DW[DataWeave Demo Flows]</w:t>
+      </w:r>
+    </w:p>
+    <w:p>
+      <w:r>
+        <w:t xml:space="preserve">    CRUD --&gt; DB[(MySQL)]</w:t>
+      </w:r>
+    </w:p>
+    <w:p>
+      <w:r>
+        <w:t xml:space="preserve">    CRUD --&gt; Notify[Notification API]</w:t>
+      </w:r>
+    </w:p>
+    <w:p>
+      <w:r>
+        <w:t xml:space="preserve">    Batch --&gt; DB</w:t>
+      </w:r>
+    </w:p>
+    <w:p>
+      <w:r>
+        <w:t xml:space="preserve">    DW --&gt; Xform[DW Usecase Scripts]</w:t>
+      </w:r>
+    </w:p>
+    <w:p>
+      <w:r>
+        <w:t>```</w:t>
+      </w:r>
+    </w:p>
+    <w:p/>
+    <w:p>
+      <w:pPr>
+        <w:pStyle w:val="Heading2"/>
+      </w:pPr>
+      <w:r>
+        <w:t>Operational Scheduler Diagram</w:t>
+      </w:r>
+    </w:p>
+    <w:p/>
+    <w:p>
+      <w:r>
+        <w:t>```mermaid</w:t>
+      </w:r>
+    </w:p>
+    <w:p>
+      <w:r>
+        <w:t>flowchart LR</w:t>
+      </w:r>
+    </w:p>
+    <w:p>
+      <w:r>
+        <w:t xml:space="preserve">    Timer[Fixed Frequency Scheduler] --&gt; HB[scheduledOperationalHeartbeat]</w:t>
+      </w:r>
+    </w:p>
+    <w:p>
+      <w:r>
+        <w:t xml:space="preserve">    HB --&gt; DB[(MySQL select 1)]</w:t>
+      </w:r>
+    </w:p>
+    <w:p>
+      <w:r>
+        <w:t xml:space="preserve">    HB --&gt; Log[Structured Logs]</w:t>
+      </w:r>
+    </w:p>
+    <w:p>
+      <w:r>
+        <w:t xml:space="preserve">    HB --&gt; Ext[External Logging Endpoint]</w:t>
+      </w:r>
+    </w:p>
+    <w:p>
+      <w:r>
+        <w:t>```</w:t>
+      </w:r>
+    </w:p>
+    <w:p/>
+    <w:p>
+      <w:pPr>
+        <w:pStyle w:val="Heading2"/>
+      </w:pPr>
+      <w:r>
+        <w:t>Postman Playground</w:t>
+      </w:r>
+    </w:p>
+    <w:p/>
+    <w:p>
+      <w:pPr>
+        <w:pStyle w:val="ListBullet"/>
+      </w:pPr>
+      <w:r>
+        <w:t>Import-ready collection for all services:</w:t>
+      </w:r>
+    </w:p>
+    <w:p>
+      <w:r>
+        <w:t xml:space="preserve">  - `postman/american-airlines-info-api-playground.postman_collection.json`</w:t>
+      </w:r>
+    </w:p>
+    <w:p>
+      <w:pPr>
+        <w:pStyle w:val="ListBullet"/>
+      </w:pPr>
+      <w:r>
+        <w:t>Import-ready environments:</w:t>
+      </w:r>
+    </w:p>
+    <w:p>
+      <w:r>
+        <w:t xml:space="preserve">  - `postman/american-airlines-info-api-cloudhub.postman_environment.json`</w:t>
+      </w:r>
+    </w:p>
+    <w:p>
+      <w:r>
+        <w:t xml:space="preserve">  - `postman/american-airlines-info-api-local.postman_environment.json`</w:t>
+      </w:r>
+    </w:p>
+    <w:p>
+      <w:pPr>
+        <w:pStyle w:val="ListBullet"/>
+      </w:pPr>
+      <w:r>
+        <w:t>Includes clear request naming, purpose descriptions, and cURL references for:</w:t>
+      </w:r>
+    </w:p>
+    <w:p>
+      <w:r>
+        <w:t xml:space="preserve">  - All `/api/flights` business services</w:t>
+      </w:r>
+    </w:p>
+    <w:p>
+      <w:r>
+        <w:t xml:space="preserve">  - Batch endpoint</w:t>
+      </w:r>
+    </w:p>
+    <w:p>
+      <w:r>
+        <w:t xml:space="preserve">  - All DataWeave demo endpoints</w:t>
+      </w:r>
+    </w:p>
+    <w:p/>
+    <w:p>
+      <w:pPr>
+        <w:pStyle w:val="Heading2"/>
+      </w:pPr>
+      <w:r>
+        <w:t>Error Handling Diagram</w:t>
+      </w:r>
+    </w:p>
+    <w:p/>
+    <w:p>
+      <w:r>
+        <w:t>```mermaid</w:t>
+      </w:r>
+    </w:p>
+    <w:p>
+      <w:r>
+        <w:t>flowchart TD</w:t>
+      </w:r>
+    </w:p>
+    <w:p>
+      <w:r>
+        <w:t xml:space="preserve">    Req[Incoming API request] --&gt; Main[APIKit main flow]</w:t>
+      </w:r>
+    </w:p>
+    <w:p>
+      <w:r>
+        <w:t xml:space="preserve">    Main --&gt; Impl{Implementation success?}</w:t>
+      </w:r>
+    </w:p>
+    <w:p>
+      <w:r>
+        <w:t xml:space="preserve">    Impl -- Yes --&gt; Success[2xx success response]</w:t>
+      </w:r>
+    </w:p>
+    <w:p>
+      <w:r>
+        <w:t xml:space="preserve">    Impl -- No --&gt; Type{Error type}</w:t>
+      </w:r>
+    </w:p>
+    <w:p>
+      <w:r>
+        <w:t xml:space="preserve">    Type -- Not Found --&gt; E404[404 response payload]</w:t>
+      </w:r>
+    </w:p>
+    <w:p>
+      <w:r>
+        <w:t xml:space="preserve">    Type -- Business Validation --&gt; E409[409 response payload]</w:t>
+      </w:r>
+    </w:p>
+    <w:p>
+      <w:r>
+        <w:t xml:space="preserve">    Type -- Bad Request --&gt; E400[400 response payload]</w:t>
+      </w:r>
+    </w:p>
+    <w:p>
+      <w:r>
+        <w:t xml:space="preserve">    Type -- Unexpected --&gt; E500[500 response payload]</w:t>
+      </w:r>
+    </w:p>
+    <w:p>
+      <w:r>
+        <w:t>```</w:t>
+      </w:r>
+    </w:p>
+    <w:p/>
+    <w:p>
+      <w:pPr>
+        <w:pStyle w:val="Heading2"/>
+      </w:pPr>
+      <w:r>
+        <w:t>Flight Management Lifecycle</w:t>
+      </w:r>
+    </w:p>
+    <w:p/>
+    <w:p>
+      <w:r>
+        <w:t>```mermaid</w:t>
+      </w:r>
+    </w:p>
+    <w:p>
+      <w:r>
+        <w:t>stateDiagram-v2</w:t>
+      </w:r>
+    </w:p>
+    <w:p>
+      <w:r>
+        <w:t xml:space="preserve">    [*] --&gt; Created: POST /api/flights</w:t>
+      </w:r>
+    </w:p>
+    <w:p>
+      <w:r>
+        <w:t xml:space="preserve">    Created --&gt; Retrieved: GET /api/flights/{ID}</w:t>
+      </w:r>
+    </w:p>
+    <w:p>
+      <w:r>
+        <w:t xml:space="preserve">    Retrieved --&gt; Updated: PUT /api/flights/{ID}</w:t>
+      </w:r>
+    </w:p>
+    <w:p>
+      <w:r>
+        <w:t xml:space="preserve">    Updated --&gt; Retrieved: GET /api/flights/{ID}</w:t>
+      </w:r>
+    </w:p>
+    <w:p>
+      <w:r>
+        <w:t xml:space="preserve">    Retrieved --&gt; Deleted: DELETE /api/flights/{ID}</w:t>
+      </w:r>
+    </w:p>
+    <w:p>
+      <w:r>
+        <w:t xml:space="preserve">    Deleted --&gt; [*]</w:t>
+      </w:r>
+    </w:p>
+    <w:p>
+      <w:r>
+        <w:t>```</w:t>
+      </w:r>
+    </w:p>
     <w:p>
       <w:pPr>
         <w:pStyle w:val="Heading1"/>
@@ -1184,11 +1727,238 @@
         <w:pStyle w:val="Heading3"/>
       </w:pPr>
       <w:r>
-        <w:t>1.4 Non-Functional Characteristics</w:t>
+        <w:t>1.4 End-to-End Request Sequence (CRUD)</w:t>
       </w:r>
     </w:p>
     <w:p/>
     <w:p>
+      <w:r>
+        <w:t>```mermaid</w:t>
+      </w:r>
+    </w:p>
+    <w:p>
+      <w:r>
+        <w:t>sequenceDiagram</w:t>
+      </w:r>
+    </w:p>
+    <w:p>
+      <w:r>
+        <w:t xml:space="preserve">    participant Client</w:t>
+      </w:r>
+    </w:p>
+    <w:p>
+      <w:r>
+        <w:t xml:space="preserve">    participant CH2 as CloudHub Ingress</w:t>
+      </w:r>
+    </w:p>
+    <w:p>
+      <w:r>
+        <w:t xml:space="preserve">    participant API as APIKit Main Flow</w:t>
+      </w:r>
+    </w:p>
+    <w:p>
+      <w:r>
+        <w:t xml:space="preserve">    participant Impl as Implementation Flow</w:t>
+      </w:r>
+    </w:p>
+    <w:p>
+      <w:r>
+        <w:t xml:space="preserve">    participant DB as MySQL</w:t>
+      </w:r>
+    </w:p>
+    <w:p>
+      <w:r>
+        <w:t xml:space="preserve">    participant Ext as Notification/External APIs</w:t>
+      </w:r>
+    </w:p>
+    <w:p/>
+    <w:p>
+      <w:r>
+        <w:t xml:space="preserve">    Client-&gt;&gt;CH2: HTTP /api/flights...</w:t>
+      </w:r>
+    </w:p>
+    <w:p>
+      <w:r>
+        <w:t xml:space="preserve">    CH2-&gt;&gt;API: Route request</w:t>
+      </w:r>
+    </w:p>
+    <w:p>
+      <w:r>
+        <w:t xml:space="preserve">    API-&gt;&gt;Impl: flow-ref by method/resource</w:t>
+      </w:r>
+    </w:p>
+    <w:p>
+      <w:r>
+        <w:t xml:space="preserve">    Impl-&gt;&gt;DB: Query/Insert/Update/Delete</w:t>
+      </w:r>
+    </w:p>
+    <w:p>
+      <w:r>
+        <w:t xml:space="preserve">    Impl--&gt;&gt;Ext: Optional outbound call</w:t>
+      </w:r>
+    </w:p>
+    <w:p>
+      <w:r>
+        <w:t xml:space="preserve">    Impl--&gt;&gt;API: Payload + status vars</w:t>
+      </w:r>
+    </w:p>
+    <w:p>
+      <w:r>
+        <w:t xml:space="preserve">    API--&gt;&gt;Client: Standardized JSON response</w:t>
+      </w:r>
+    </w:p>
+    <w:p>
+      <w:r>
+        <w:t>```</w:t>
+      </w:r>
+    </w:p>
+    <w:p/>
+    <w:p>
+      <w:pPr>
+        <w:pStyle w:val="Heading3"/>
+      </w:pPr>
+      <w:r>
+        <w:t>1.5 Scheduler and Operational Flow Sequence</w:t>
+      </w:r>
+    </w:p>
+    <w:p/>
+    <w:p>
+      <w:r>
+        <w:t>```mermaid</w:t>
+      </w:r>
+    </w:p>
+    <w:p>
+      <w:r>
+        <w:t>sequenceDiagram</w:t>
+      </w:r>
+    </w:p>
+    <w:p>
+      <w:r>
+        <w:t xml:space="preserve">    participant Scheduler</w:t>
+      </w:r>
+    </w:p>
+    <w:p>
+      <w:r>
+        <w:t xml:space="preserve">    participant Ops as scheduledOperationalHeartbeat</w:t>
+      </w:r>
+    </w:p>
+    <w:p>
+      <w:r>
+        <w:t xml:space="preserve">    participant DB as MySQL</w:t>
+      </w:r>
+    </w:p>
+    <w:p>
+      <w:r>
+        <w:t xml:space="preserve">    participant Log as Mule Logger</w:t>
+      </w:r>
+    </w:p>
+    <w:p>
+      <w:r>
+        <w:t xml:space="preserve">    participant Ext as External Logging Endpoint</w:t>
+      </w:r>
+    </w:p>
+    <w:p/>
+    <w:p>
+      <w:r>
+        <w:t xml:space="preserve">    Scheduler-&gt;&gt;Ops: Trigger every N seconds</w:t>
+      </w:r>
+    </w:p>
+    <w:p>
+      <w:r>
+        <w:t xml:space="preserve">    Ops-&gt;&gt;DB: select 1 as ok</w:t>
+      </w:r>
+    </w:p>
+    <w:p>
+      <w:r>
+        <w:t xml:space="preserve">    DB--&gt;&gt;Ops: heartbeat status</w:t>
+      </w:r>
+    </w:p>
+    <w:p>
+      <w:r>
+        <w:t xml:space="preserve">    Ops-&gt;&gt;Log: txId + event=ops.heartbeat.success/failure</w:t>
+      </w:r>
+    </w:p>
+    <w:p>
+      <w:r>
+        <w:t xml:space="preserve">    Ops--&gt;&gt;Ext: POST operational log (if enabled)</w:t>
+      </w:r>
+    </w:p>
+    <w:p>
+      <w:r>
+        <w:t>```</w:t>
+      </w:r>
+    </w:p>
+    <w:p/>
+    <w:p>
+      <w:pPr>
+        <w:pStyle w:val="Heading3"/>
+      </w:pPr>
+      <w:r>
+        <w:t>1.6 Batch Processing Design View</w:t>
+      </w:r>
+    </w:p>
+    <w:p/>
+    <w:p>
+      <w:r>
+        <w:t>```mermaid</w:t>
+      </w:r>
+    </w:p>
+    <w:p>
+      <w:r>
+        <w:t>flowchart LR</w:t>
+      </w:r>
+    </w:p>
+    <w:p>
+      <w:r>
+        <w:t xml:space="preserve">    R[POST /api/flights/batch] --&gt; B[postFlightsBatch]</w:t>
+      </w:r>
+    </w:p>
+    <w:p>
+      <w:r>
+        <w:t xml:space="preserve">    B --&gt; S[Split batch records]</w:t>
+      </w:r>
+    </w:p>
+    <w:p>
+      <w:r>
+        <w:t xml:space="preserve">    S --&gt; P[Per-record processing]</w:t>
+      </w:r>
+    </w:p>
+    <w:p>
+      <w:r>
+        <w:t xml:space="preserve">    P --&gt; OK[Success counter]</w:t>
+      </w:r>
+    </w:p>
+    <w:p>
+      <w:r>
+        <w:t xml:space="preserve">    P --&gt; ER[Failure capture store]</w:t>
+      </w:r>
+    </w:p>
+    <w:p>
+      <w:r>
+        <w:t xml:space="preserve">    OK --&gt; RES[Consolidated response]</w:t>
+      </w:r>
+    </w:p>
+    <w:p>
+      <w:r>
+        <w:t xml:space="preserve">    ER --&gt; RES</w:t>
+      </w:r>
+    </w:p>
+    <w:p>
+      <w:r>
+        <w:t>```</w:t>
+      </w:r>
+    </w:p>
+    <w:p/>
+    <w:p>
+      <w:pPr>
+        <w:pStyle w:val="Heading3"/>
+      </w:pPr>
+      <w:r>
+        <w:t>1.7 Non-Functional Characteristics</w:t>
+      </w:r>
+    </w:p>
+    <w:p/>
+    <w:p>
       <w:pPr>
         <w:pStyle w:val="ListBullet"/>
       </w:pPr>
@@ -1502,6 +2272,212 @@
         <w:t>Rolling + JSON console logging in `log4j2.xml`</w:t>
       </w:r>
     </w:p>
+    <w:p/>
+    <w:p>
+      <w:pPr>
+        <w:pStyle w:val="Heading3"/>
+      </w:pPr>
+      <w:r>
+        <w:t>2.7 Error Handling Flow Diagram</w:t>
+      </w:r>
+    </w:p>
+    <w:p/>
+    <w:p>
+      <w:r>
+        <w:t>```mermaid</w:t>
+      </w:r>
+    </w:p>
+    <w:p>
+      <w:r>
+        <w:t>flowchart TD</w:t>
+      </w:r>
+    </w:p>
+    <w:p>
+      <w:r>
+        <w:t xml:space="preserve">    IN[Request enters APIKit flow] --&gt; TRY{Business flow succeeds?}</w:t>
+      </w:r>
+    </w:p>
+    <w:p>
+      <w:r>
+        <w:t xml:space="preserve">    TRY -- Yes --&gt; OK[Build success payload]</w:t>
+      </w:r>
+    </w:p>
+    <w:p>
+      <w:r>
+        <w:t xml:space="preserve">    OK --&gt; CODE200[Set status 200/201/202]</w:t>
+      </w:r>
+    </w:p>
+    <w:p>
+      <w:r>
+        <w:t xml:space="preserve">    CODE200 --&gt; OUT[Return response]</w:t>
+      </w:r>
+    </w:p>
+    <w:p/>
+    <w:p>
+      <w:r>
+        <w:t xml:space="preserve">    TRY -- No --&gt; ERR{Error type}</w:t>
+      </w:r>
+    </w:p>
+    <w:p>
+      <w:r>
+        <w:t xml:space="preserve">    ERR -- APP:NOT_FOUND --&gt; N404[Map to 404 JSON message]</w:t>
+      </w:r>
+    </w:p>
+    <w:p>
+      <w:r>
+        <w:t xml:space="preserve">    ERR -- BUSINESS_VALIDATION --&gt; N409[Map to 409 validation payload]</w:t>
+      </w:r>
+    </w:p>
+    <w:p>
+      <w:r>
+        <w:t xml:space="preserve">    ERR -- APIKIT:BAD_REQUEST --&gt; N400[Map to 400 malformed request payload]</w:t>
+      </w:r>
+    </w:p>
+    <w:p>
+      <w:r>
+        <w:t xml:space="preserve">    ERR -- Any other --&gt; N500[Map to 500 generic error payload]</w:t>
+      </w:r>
+    </w:p>
+    <w:p>
+      <w:r>
+        <w:t xml:space="preserve">    N404 --&gt; OUT</w:t>
+      </w:r>
+    </w:p>
+    <w:p>
+      <w:r>
+        <w:t xml:space="preserve">    N409 --&gt; OUT</w:t>
+      </w:r>
+    </w:p>
+    <w:p>
+      <w:r>
+        <w:t xml:space="preserve">    N400 --&gt; OUT</w:t>
+      </w:r>
+    </w:p>
+    <w:p>
+      <w:r>
+        <w:t xml:space="preserve">    N500 --&gt; OUT</w:t>
+      </w:r>
+    </w:p>
+    <w:p>
+      <w:r>
+        <w:t>```</w:t>
+      </w:r>
+    </w:p>
+    <w:p/>
+    <w:p>
+      <w:pPr>
+        <w:pStyle w:val="Heading3"/>
+      </w:pPr>
+      <w:r>
+        <w:t>2.8 Flight Management Lifecycle Diagram</w:t>
+      </w:r>
+    </w:p>
+    <w:p/>
+    <w:p>
+      <w:r>
+        <w:t>```mermaid</w:t>
+      </w:r>
+    </w:p>
+    <w:p>
+      <w:r>
+        <w:t>stateDiagram-v2</w:t>
+      </w:r>
+    </w:p>
+    <w:p>
+      <w:r>
+        <w:t xml:space="preserve">    [*] --&gt; Draft: Create Flight</w:t>
+      </w:r>
+    </w:p>
+    <w:p>
+      <w:r>
+        <w:t xml:space="preserve">    Draft --&gt; Scheduled: Save valid record</w:t>
+      </w:r>
+    </w:p>
+    <w:p>
+      <w:r>
+        <w:t xml:space="preserve">    Scheduled --&gt; Updated: Update Flight</w:t>
+      </w:r>
+    </w:p>
+    <w:p>
+      <w:r>
+        <w:t xml:space="preserve">    Updated --&gt; Scheduled: Re-plan / Update again</w:t>
+      </w:r>
+    </w:p>
+    <w:p>
+      <w:r>
+        <w:t xml:space="preserve">    Scheduled --&gt; Deleted: Delete by ID</w:t>
+      </w:r>
+    </w:p>
+    <w:p>
+      <w:r>
+        <w:t xml:space="preserve">    Updated --&gt; Deleted: Delete by ID</w:t>
+      </w:r>
+    </w:p>
+    <w:p>
+      <w:r>
+        <w:t xml:space="preserve">    Deleted --&gt; [*]</w:t>
+      </w:r>
+    </w:p>
+    <w:p>
+      <w:r>
+        <w:t>```</w:t>
+      </w:r>
+    </w:p>
+    <w:p/>
+    <w:p>
+      <w:pPr>
+        <w:pStyle w:val="Heading3"/>
+      </w:pPr>
+      <w:r>
+        <w:t>2.9 API-to-Implementation Mapping Diagram</w:t>
+      </w:r>
+    </w:p>
+    <w:p/>
+    <w:p>
+      <w:r>
+        <w:t>```mermaid</w:t>
+      </w:r>
+    </w:p>
+    <w:p>
+      <w:r>
+        <w:t>flowchart LR</w:t>
+      </w:r>
+    </w:p>
+    <w:p>
+      <w:r>
+        <w:t xml:space="preserve">    A1[GET /api/flights] --&gt; F1[getAllFlights]</w:t>
+      </w:r>
+    </w:p>
+    <w:p>
+      <w:r>
+        <w:t xml:space="preserve">    A2[GET /api/flights/{ID}] --&gt; F2[getFlightById]</w:t>
+      </w:r>
+    </w:p>
+    <w:p>
+      <w:r>
+        <w:t xml:space="preserve">    A3[POST /api/flights] --&gt; F3[postFlights]</w:t>
+      </w:r>
+    </w:p>
+    <w:p>
+      <w:r>
+        <w:t xml:space="preserve">    A4[PUT /api/flights/{ID}] --&gt; F4[updateFlightById]</w:t>
+      </w:r>
+    </w:p>
+    <w:p>
+      <w:r>
+        <w:t xml:space="preserve">    A5[DELETE /api/flights/{ID}] --&gt; F5[deleteFlightById]</w:t>
+      </w:r>
+    </w:p>
+    <w:p>
+      <w:r>
+        <w:t xml:space="preserve">    A6[POST /api/flights/batch] --&gt; F6[postFlightsBatch]</w:t>
+      </w:r>
+    </w:p>
+    <w:p>
+      <w:r>
+        <w:t>```</w:t>
+      </w:r>
+    </w:p>
     <w:p>
       <w:pPr>
         <w:pStyle w:val="Heading1"/>
@@ -1978,17 +2954,22 @@
     </w:p>
     <w:p>
       <w:r>
-        <w:t xml:space="preserve">  - Use Design Center project upload flow to keep RAML structure intact.</w:t>
-      </w:r>
-    </w:p>
-    <w:p>
-      <w:r>
-        <w:t xml:space="preserve">  - Publish API spec to Exchange as `rest-api` with explicit versioning.</w:t>
-      </w:r>
-    </w:p>
-    <w:p>
-      <w:r>
-        <w:t xml:space="preserve">  - Maintain RAML + examples + exchange modules together for portability.</w:t>
+        <w:t xml:space="preserve">  - Use Design Center project upload flow to keep RAML structure intact and avoid manual drift.</w:t>
+      </w:r>
+    </w:p>
+    <w:p>
+      <w:r>
+        <w:t xml:space="preserve">  - Publish API spec to Exchange as `rest-api` with explicit versioning (`1.0.0` -&gt; `1.0.1`) to avoid immutable-version conflicts.</w:t>
+      </w:r>
+    </w:p>
+    <w:p>
+      <w:r>
+        <w:t xml:space="preserve">  - Maintain RAML + examples + exchange modules together for portability and parser consistency.</w:t>
+      </w:r>
+    </w:p>
+    <w:p>
+      <w:r>
+        <w:t xml:space="preserve">  - Respect Exchange asset-type constraints (`rest-api` vs `app`) during publication workflows.</w:t>
       </w:r>
     </w:p>
     <w:p>
@@ -2014,6 +2995,11 @@
         <w:t xml:space="preserve">  - Keep environment-specific config pattern: `config-${mule.env}.properties` and secure variant.</w:t>
       </w:r>
     </w:p>
+    <w:p>
+      <w:r>
+        <w:t xml:space="preserve">  - Treat standalone runtime and Studio-launched runtime as separate diagnostic modes to isolate local lock/runtime issues.</w:t>
+      </w:r>
+    </w:p>
     <w:p/>
     <w:p>
       <w:pPr>
@@ -2314,7 +3300,7 @@
         <w:pStyle w:val="ListBullet"/>
       </w:pPr>
       <w:r>
-        <w:t>`git remote add origin https://github.com/kedarawasthi/test-mule-cursur-project.git`</w:t>
+        <w:t>`git remote add origin https://github.com/kedarawasthi/airline-mule-cursur-project.git`</w:t>
       </w:r>
     </w:p>
     <w:p>
@@ -2375,17 +3361,71 @@
         <w:t>| Existing Exchange version publish conflict (`409`) | Version already published | Published next version (`1.0.1`) successfully |</w:t>
       </w:r>
     </w:p>
+    <w:p>
+      <w:r>
+        <w:t>| MUnit with Mule standalone runtime repeatedly blocked | Combined issues across EE Maven auth (`401`), runtime/library mismatch, and local process/file locks while trying standalone execution | De-prioritized MUnit execution path for delivery continuity; focused on local/CloudHub functional validation, preserved MUnit artifacts for later stabilization sprint |</w:t>
+      </w:r>
+    </w:p>
+    <w:p>
+      <w:r>
+        <w:t>| Exchange docs not visible on asset home page | Asset page `home` remained empty because documentation markdown was not pushed to Exchange page endpoint | Added explicit Exchange page publish step via Exchange API (`draft/pages/home` + asset publish patch) |</w:t>
+      </w:r>
+    </w:p>
     <w:p/>
     <w:p>
       <w:pPr>
         <w:pStyle w:val="Heading2"/>
       </w:pPr>
       <w:r>
-        <w:t>6) Net Outcome</w:t>
+        <w:t>6) Pain Points and Where Cursor Clearly Lagged</w:t>
       </w:r>
     </w:p>
     <w:p/>
     <w:p>
+      <w:r>
+        <w:t>| Area | Pain Point Observed | Impact | Cursor Limitation Noted |</w:t>
+      </w:r>
+    </w:p>
+    <w:p>
+      <w:r>
+        <w:t>|---|---|---|---|</w:t>
+      </w:r>
+    </w:p>
+    <w:p>
+      <w:r>
+        <w:t>| Enterprise Dependency/Auth | EE artifact auth and repo constraints caused repeated build/test blockers | Delayed MUnit and some module retrieval | Cursor can diagnose quickly, but cannot bypass enterprise credential policies or role/scope limits |</w:t>
+      </w:r>
+    </w:p>
+    <w:p>
+      <w:r>
+        <w:t>| APIM Registration | Runtime active but APIM remained `unregistered` in target stream | Governance path not fully closed in same timeline | Cursor can automate checks and retries, but platform-side control-plane issues still require deeper tenant-level support |</w:t>
+      </w:r>
+    </w:p>
+    <w:p>
+      <w:r>
+        <w:t>| Windows Runtime/Pathing | File locks and long path limits affected build/git workflows | Slower iteration and commit packaging | Cursor needed workaround steps (short path, excludes), not a native fix |</w:t>
+      </w:r>
+    </w:p>
+    <w:p>
+      <w:r>
+        <w:t>| Exchange Asset-Type Rules | `rest-api` vs app-asset publication mismatch created alignment friction | Prevented one-pass "single asset" deploy path | Cursor can detect and explain constraints, but cannot change Exchange type semantics |</w:t>
+      </w:r>
+    </w:p>
+    <w:p>
+      <w:r>
+        <w:t>| Standalone MUnit Execution | Local standalone runtime path unstable for reliable MUnit pass in this environment | Reduced automated test closure | Cursor had to shift to functional verification strategy to maintain delivery speed |</w:t>
+      </w:r>
+    </w:p>
+    <w:p>
+      <w:pPr>
+        <w:pStyle w:val="Heading2"/>
+      </w:pPr>
+      <w:r>
+        <w:t>7) Net Outcome</w:t>
+      </w:r>
+    </w:p>
+    <w:p/>
+    <w:p>
       <w:pPr>
         <w:pStyle w:val="ListBullet"/>
       </w:pPr>
@@ -3234,7 +4274,47 @@
         <w:pStyle w:val="Heading2"/>
       </w:pPr>
       <w:r>
-        <w:t>6) Executive Conclusion</w:t>
+        <w:t>6) Where Cursor Clearly Lags (Observed)</w:t>
+      </w:r>
+    </w:p>
+    <w:p/>
+    <w:p>
+      <w:r>
+        <w:t>| Domain | Gap | Why it matters |</w:t>
+      </w:r>
+    </w:p>
+    <w:p>
+      <w:r>
+        <w:t>|---|---|---|</w:t>
+      </w:r>
+    </w:p>
+    <w:p>
+      <w:r>
+        <w:t>| Enterprise auth and repository policy | Cannot bypass organization credential/scope limitations (EE Maven, APIM role scopes) | Repeated blockers in MUnit/EE artifact and platform governance flows |</w:t>
+      </w:r>
+    </w:p>
+    <w:p>
+      <w:r>
+        <w:t>| APIM control-plane stabilization | Strong diagnostics but final registration outcome depends on platform-side consistency | Delivery can be functionally complete while governance remains partially open |</w:t>
+      </w:r>
+    </w:p>
+    <w:p>
+      <w:r>
+        <w:t>| Local runtime determinism | Standalone runtime + Windows lock/path constraints still require manual environment hygiene | Slows test loops and standalone MUnit reliability |</w:t>
+      </w:r>
+    </w:p>
+    <w:p>
+      <w:r>
+        <w:t>| Asset-type governance in Exchange | Cursor can detect constraints but cannot merge incompatible asset types (`rest-api` vs app) | Requires explicit asset strategy decisions by platform governance owners |</w:t>
+      </w:r>
+    </w:p>
+    <w:p/>
+    <w:p>
+      <w:pPr>
+        <w:pStyle w:val="Heading2"/>
+      </w:pPr>
+      <w:r>
+        <w:t>7) Executive Conclusion</w:t>
       </w:r>
     </w:p>
     <w:p/>

</xml_diff>

<commit_message>
Add code review findings document and link it across documentation indexes.
Capture unbiased airline code review observations with prioritized fix proposals, include it in navigation/index files, and regenerate the consolidated Word documentation pack.

Made-with: Cursor
</commit_message>
<xml_diff>
--- a/docs/MASTER_DOCUMENTATION.docx
+++ b/docs/MASTER_DOCUMENTATION.docx
@@ -119,7 +119,17 @@
     </w:p>
     <w:p>
       <w:r>
-        <w:t>8. `docs/CURSOR_TDLC_METRICS_FILLED.md`</w:t>
+        <w:t>8. `docs/CODE_REVIEW_COMMENTS_AND_FIXES_PROPOSED.md`</w:t>
+      </w:r>
+    </w:p>
+    <w:p>
+      <w:r>
+        <w:t xml:space="preserve">   - Unbiased code review findings with prioritized remediation plan and definition of done.</w:t>
+      </w:r>
+    </w:p>
+    <w:p>
+      <w:r>
+        <w:t>9. `docs/CURSOR_TDLC_METRICS_FILLED.md`</w:t>
       </w:r>
     </w:p>
     <w:p>
@@ -129,7 +139,7 @@
     </w:p>
     <w:p>
       <w:r>
-        <w:t>9. `docs/EXECUTIVE_SCORECARD.md`</w:t>
+        <w:t>10. `docs/EXECUTIVE_SCORECARD.md`</w:t>
       </w:r>
     </w:p>
     <w:p>
@@ -819,6 +829,14 @@
         <w:pStyle w:val="ListBullet"/>
       </w:pPr>
       <w:r>
+        <w:t>`docs/CODE_REVIEW_COMMENTS_AND_FIXES_PROPOSED.md` - Unbiased code review assessment with prioritized fixes and hardening sequence.</w:t>
+      </w:r>
+    </w:p>
+    <w:p>
+      <w:pPr>
+        <w:pStyle w:val="ListBullet"/>
+      </w:pPr>
+      <w:r>
         <w:t>`docs/CURSOR_TDLC_METRICS_FILLED.md` - Filled Cursor-specific TDLC metrics from attached matrix.</w:t>
       </w:r>
     </w:p>
@@ -4530,6 +4548,509 @@
     <w:p>
       <w:r>
         <w:t>```</w:t>
+      </w:r>
+    </w:p>
+    <w:p>
+      <w:pPr>
+        <w:pStyle w:val="Heading1"/>
+      </w:pPr>
+      <w:r>
+        <w:t>Code Review Comments and Fixes Proposed</w:t>
+      </w:r>
+    </w:p>
+    <w:p>
+      <w:pPr>
+        <w:pStyle w:val="Heading1"/>
+      </w:pPr>
+      <w:r>
+        <w:t>Airline Code Review - Comments and Fixes Proposed</w:t>
+      </w:r>
+    </w:p>
+    <w:p/>
+    <w:p>
+      <w:r>
+        <w:t>This review captures an unbiased coding-practice assessment of the current airline Mule codebase and proposes concrete remediation actions.</w:t>
+      </w:r>
+    </w:p>
+    <w:p/>
+    <w:p>
+      <w:pPr>
+        <w:pStyle w:val="Heading2"/>
+      </w:pPr>
+      <w:r>
+        <w:t>1) Review Summary</w:t>
+      </w:r>
+    </w:p>
+    <w:p/>
+    <w:p>
+      <w:pPr>
+        <w:pStyle w:val="ListBullet"/>
+      </w:pPr>
+      <w:r>
+        <w:t>Overall architecture and API organization are strong.</w:t>
+      </w:r>
+    </w:p>
+    <w:p>
+      <w:pPr>
+        <w:pStyle w:val="ListBullet"/>
+      </w:pPr>
+      <w:r>
+        <w:t>Observability and operational readiness are above baseline.</w:t>
+      </w:r>
+    </w:p>
+    <w:p>
+      <w:pPr>
+        <w:pStyle w:val="ListBullet"/>
+      </w:pPr>
+      <w:r>
+        <w:t>Security hygiene and contract-implementation alignment need targeted hardening.</w:t>
+      </w:r>
+    </w:p>
+    <w:p/>
+    <w:p>
+      <w:pPr>
+        <w:pStyle w:val="Heading2"/>
+      </w:pPr>
+      <w:r>
+        <w:t>2) Findings and Proposed Fixes</w:t>
+      </w:r>
+    </w:p>
+    <w:p/>
+    <w:p>
+      <w:pPr>
+        <w:pStyle w:val="Heading3"/>
+      </w:pPr>
+      <w:r>
+        <w:t>High Priority</w:t>
+      </w:r>
+    </w:p>
+    <w:p/>
+    <w:p>
+      <w:r>
+        <w:t>1. **Sensitive values committed in repository**</w:t>
+      </w:r>
+    </w:p>
+    <w:p>
+      <w:r>
+        <w:t xml:space="preserve">   - **Observed**:</w:t>
+      </w:r>
+    </w:p>
+    <w:p>
+      <w:r>
+        <w:t xml:space="preserve">     - Plaintext credentials/placeholders in runtime config and test fixtures.</w:t>
+      </w:r>
+    </w:p>
+    <w:p>
+      <w:r>
+        <w:t xml:space="preserve">     - Example: `src/main/resources/config-dev-secure.properties` and test attribute DWL files containing `client_secret`.</w:t>
+      </w:r>
+    </w:p>
+    <w:p>
+      <w:r>
+        <w:t xml:space="preserve">   - **Risk**:</w:t>
+      </w:r>
+    </w:p>
+    <w:p>
+      <w:r>
+        <w:t xml:space="preserve">     - Secret leakage, compliance violations, and audit failures.</w:t>
+      </w:r>
+    </w:p>
+    <w:p>
+      <w:r>
+        <w:t xml:space="preserve">   - **Proposed Fix**:</w:t>
+      </w:r>
+    </w:p>
+    <w:p>
+      <w:r>
+        <w:t xml:space="preserve">     - Remove all secrets from tracked files and rotate exposed credentials.</w:t>
+      </w:r>
+    </w:p>
+    <w:p>
+      <w:r>
+        <w:t xml:space="preserve">     - Keep only encrypted values in `config-${mule.env}-secure.properties`.</w:t>
+      </w:r>
+    </w:p>
+    <w:p>
+      <w:r>
+        <w:t xml:space="preserve">     - Use CI/CD secret injection and secure Runtime Manager properties.</w:t>
+      </w:r>
+    </w:p>
+    <w:p>
+      <w:r>
+        <w:t xml:space="preserve">     - Add secret-scanning pre-commit and CI checks.</w:t>
+      </w:r>
+    </w:p>
+    <w:p/>
+    <w:p>
+      <w:r>
+        <w:t>2. **API contract mismatch for delete business validation**</w:t>
+      </w:r>
+    </w:p>
+    <w:p>
+      <w:r>
+        <w:t xml:space="preserve">   - **Observed**:</w:t>
+      </w:r>
+    </w:p>
+    <w:p>
+      <w:r>
+        <w:t xml:space="preserve">     - RAML advertises `409 Cannot delete flight with active bookings`.</w:t>
+      </w:r>
+    </w:p>
+    <w:p>
+      <w:r>
+        <w:t xml:space="preserve">     - `deleteFlightById` implementation currently validates existence only, then deletes.</w:t>
+      </w:r>
+    </w:p>
+    <w:p>
+      <w:r>
+        <w:t xml:space="preserve">   - **Risk**:</w:t>
+      </w:r>
+    </w:p>
+    <w:p>
+      <w:r>
+        <w:t xml:space="preserve">     - Contract drift, consumer trust erosion, and governance non-conformance.</w:t>
+      </w:r>
+    </w:p>
+    <w:p>
+      <w:r>
+        <w:t xml:space="preserve">   - **Proposed Fix**:</w:t>
+      </w:r>
+    </w:p>
+    <w:p>
+      <w:r>
+        <w:t xml:space="preserve">     - Before delete, query active bookings from `flight_bookings`.</w:t>
+      </w:r>
+    </w:p>
+    <w:p>
+      <w:r>
+        <w:t xml:space="preserve">     - Return business validation payload + HTTP 409 when active bookings exist.</w:t>
+      </w:r>
+    </w:p>
+    <w:p>
+      <w:r>
+        <w:t xml:space="preserve">     - Add regression tests for both `404` and `409` delete scenarios.</w:t>
+      </w:r>
+    </w:p>
+    <w:p/>
+    <w:p>
+      <w:pPr>
+        <w:pStyle w:val="Heading3"/>
+      </w:pPr>
+      <w:r>
+        <w:t>Medium Priority</w:t>
+      </w:r>
+    </w:p>
+    <w:p/>
+    <w:p>
+      <w:r>
+        <w:t>3. **Internal error details returned to API consumers**</w:t>
+      </w:r>
+    </w:p>
+    <w:p>
+      <w:r>
+        <w:t xml:space="preserve">   - **Observed**:</w:t>
+      </w:r>
+    </w:p>
+    <w:p>
+      <w:r>
+        <w:t xml:space="preserve">     - DB error path includes raw `error.description` in API response body.</w:t>
+      </w:r>
+    </w:p>
+    <w:p>
+      <w:r>
+        <w:t xml:space="preserve">   - **Risk**:</w:t>
+      </w:r>
+    </w:p>
+    <w:p>
+      <w:r>
+        <w:t xml:space="preserve">     - Information disclosure of internals and infrastructure details.</w:t>
+      </w:r>
+    </w:p>
+    <w:p>
+      <w:r>
+        <w:t xml:space="preserve">   - **Proposed Fix**:</w:t>
+      </w:r>
+    </w:p>
+    <w:p>
+      <w:r>
+        <w:t xml:space="preserve">     - Return standardized generic error externally.</w:t>
+      </w:r>
+    </w:p>
+    <w:p>
+      <w:r>
+        <w:t xml:space="preserve">     - Log detailed error internally with `transactionId` and `correlationId`.</w:t>
+      </w:r>
+    </w:p>
+    <w:p/>
+    <w:p>
+      <w:r>
+        <w:t>4. **`select *` in main read queries**</w:t>
+      </w:r>
+    </w:p>
+    <w:p>
+      <w:r>
+        <w:t xml:space="preserve">   - **Observed**:</w:t>
+      </w:r>
+    </w:p>
+    <w:p>
+      <w:r>
+        <w:t xml:space="preserve">     - `getAllFlights` and `getFlightById` use `select *`.</w:t>
+      </w:r>
+    </w:p>
+    <w:p>
+      <w:r>
+        <w:t xml:space="preserve">   - **Risk**:</w:t>
+      </w:r>
+    </w:p>
+    <w:p>
+      <w:r>
+        <w:t xml:space="preserve">     - Fragility under schema evolution and unnecessary payload coupling.</w:t>
+      </w:r>
+    </w:p>
+    <w:p>
+      <w:r>
+        <w:t xml:space="preserve">   - **Proposed Fix**:</w:t>
+      </w:r>
+    </w:p>
+    <w:p>
+      <w:r>
+        <w:t xml:space="preserve">     - Use explicit column projection with aliasing aligned to response model.</w:t>
+      </w:r>
+    </w:p>
+    <w:p>
+      <w:r>
+        <w:t xml:space="preserve">     - Keep transformation mappings deterministic and contract-friendly.</w:t>
+      </w:r>
+    </w:p>
+    <w:p/>
+    <w:p>
+      <w:r>
+        <w:t>5. **Update flow success path does not assert affected rows**</w:t>
+      </w:r>
+    </w:p>
+    <w:p>
+      <w:r>
+        <w:t xml:space="preserve">   - **Observed**:</w:t>
+      </w:r>
+    </w:p>
+    <w:p>
+      <w:r>
+        <w:t xml:space="preserve">     - `updateFlightById` does not validate update count prior to success path/notification.</w:t>
+      </w:r>
+    </w:p>
+    <w:p>
+      <w:r>
+        <w:t xml:space="preserve">   - **Risk**:</w:t>
+      </w:r>
+    </w:p>
+    <w:p>
+      <w:r>
+        <w:t xml:space="preserve">     - False-success response for non-existent IDs.</w:t>
+      </w:r>
+    </w:p>
+    <w:p>
+      <w:r>
+        <w:t xml:space="preserve">   - **Proposed Fix**:</w:t>
+      </w:r>
+    </w:p>
+    <w:p>
+      <w:r>
+        <w:t xml:space="preserve">     - Validate DB update result (`updatedRows &gt; 0`).</w:t>
+      </w:r>
+    </w:p>
+    <w:p>
+      <w:r>
+        <w:t xml:space="preserve">     - Return 404-style payload when no row is updated.</w:t>
+      </w:r>
+    </w:p>
+    <w:p>
+      <w:r>
+        <w:t xml:space="preserve">     - Only trigger downstream notification for successful updates.</w:t>
+      </w:r>
+    </w:p>
+    <w:p/>
+    <w:p>
+      <w:pPr>
+        <w:pStyle w:val="Heading3"/>
+      </w:pPr>
+      <w:r>
+        <w:t>Low Priority</w:t>
+      </w:r>
+    </w:p>
+    <w:p/>
+    <w:p>
+      <w:r>
+        <w:t>6. **Configuration source overlap**</w:t>
+      </w:r>
+    </w:p>
+    <w:p>
+      <w:r>
+        <w:t xml:space="preserve">   - **Observed**:</w:t>
+      </w:r>
+    </w:p>
+    <w:p>
+      <w:r>
+        <w:t xml:space="preserve">     - `application.yaml` and env-property files both carry config patterns.</w:t>
+      </w:r>
+    </w:p>
+    <w:p>
+      <w:r>
+        <w:t xml:space="preserve">   - **Risk**:</w:t>
+      </w:r>
+    </w:p>
+    <w:p>
+      <w:r>
+        <w:t xml:space="preserve">     - Ambiguity and accidental fallback behavior.</w:t>
+      </w:r>
+    </w:p>
+    <w:p>
+      <w:r>
+        <w:t xml:space="preserve">   - **Proposed Fix**:</w:t>
+      </w:r>
+    </w:p>
+    <w:p>
+      <w:r>
+        <w:t xml:space="preserve">     - Keep one source-of-truth model (`config-${mule.env}.properties` + secure counterpart).</w:t>
+      </w:r>
+    </w:p>
+    <w:p>
+      <w:r>
+        <w:t xml:space="preserve">     - Retain only non-sensitive defaults in `application.yaml`, or remove duplicated keys.</w:t>
+      </w:r>
+    </w:p>
+    <w:p/>
+    <w:p>
+      <w:pPr>
+        <w:pStyle w:val="Heading2"/>
+      </w:pPr>
+      <w:r>
+        <w:t>3) Positive Practices Already Followed</w:t>
+      </w:r>
+    </w:p>
+    <w:p/>
+    <w:p>
+      <w:pPr>
+        <w:pStyle w:val="ListBullet"/>
+      </w:pPr>
+      <w:r>
+        <w:t>Environment-based property loading pattern is in place.</w:t>
+      </w:r>
+    </w:p>
+    <w:p>
+      <w:pPr>
+        <w:pStyle w:val="ListBullet"/>
+      </w:pPr>
+      <w:r>
+        <w:t>APIKit listener and error mapping structure is organized and consistent.</w:t>
+      </w:r>
+    </w:p>
+    <w:p>
+      <w:pPr>
+        <w:pStyle w:val="ListBullet"/>
+      </w:pPr>
+      <w:r>
+        <w:t>Circuit breaker design for DB resilience is implemented.</w:t>
+      </w:r>
+    </w:p>
+    <w:p>
+      <w:pPr>
+        <w:pStyle w:val="ListBullet"/>
+      </w:pPr>
+      <w:r>
+        <w:t>Scheduler heartbeat with operational logging is present.</w:t>
+      </w:r>
+    </w:p>
+    <w:p>
+      <w:pPr>
+        <w:pStyle w:val="ListBullet"/>
+      </w:pPr>
+      <w:r>
+        <w:t>Parameterized DB queries are used in CRUD operations.</w:t>
+      </w:r>
+    </w:p>
+    <w:p/>
+    <w:p>
+      <w:pPr>
+        <w:pStyle w:val="Heading2"/>
+      </w:pPr>
+      <w:r>
+        <w:t>4) Suggested Hardening Sequence</w:t>
+      </w:r>
+    </w:p>
+    <w:p/>
+    <w:p>
+      <w:r>
+        <w:t>1. Secret remediation and credential rotation.</w:t>
+      </w:r>
+    </w:p>
+    <w:p>
+      <w:r>
+        <w:t>2. Delete-flow contract alignment (`409` for active bookings).</w:t>
+      </w:r>
+    </w:p>
+    <w:p>
+      <w:r>
+        <w:t>3. Error-response sanitization.</w:t>
+      </w:r>
+    </w:p>
+    <w:p>
+      <w:r>
+        <w:t>4. SQL projection cleanup and update-count guard.</w:t>
+      </w:r>
+    </w:p>
+    <w:p>
+      <w:r>
+        <w:t>5. Configuration source consolidation.</w:t>
+      </w:r>
+    </w:p>
+    <w:p/>
+    <w:p>
+      <w:pPr>
+        <w:pStyle w:val="Heading2"/>
+      </w:pPr>
+      <w:r>
+        <w:t>5) Definition of Done for Fix Cycle</w:t>
+      </w:r>
+    </w:p>
+    <w:p/>
+    <w:p>
+      <w:pPr>
+        <w:pStyle w:val="ListBullet"/>
+      </w:pPr>
+      <w:r>
+        <w:t>No plaintext credentials in repo.</w:t>
+      </w:r>
+    </w:p>
+    <w:p>
+      <w:pPr>
+        <w:pStyle w:val="ListBullet"/>
+      </w:pPr>
+      <w:r>
+        <w:t>Delete API behavior fully aligned with RAML (`200/404/409` paths).</w:t>
+      </w:r>
+    </w:p>
+    <w:p>
+      <w:pPr>
+        <w:pStyle w:val="ListBullet"/>
+      </w:pPr>
+      <w:r>
+        <w:t>No internal stack/error detail exposed to clients.</w:t>
+      </w:r>
+    </w:p>
+    <w:p>
+      <w:pPr>
+        <w:pStyle w:val="ListBullet"/>
+      </w:pPr>
+      <w:r>
+        <w:t>`select *` removed from primary read paths.</w:t>
+      </w:r>
+    </w:p>
+    <w:p>
+      <w:pPr>
+        <w:pStyle w:val="ListBullet"/>
+      </w:pPr>
+      <w:r>
+        <w:t>Regression tests updated for all corrected behavior.</w:t>
       </w:r>
     </w:p>
     <w:p>

</xml_diff>

<commit_message>
Add airline prompt-time ledger with TDLC correlation traceability.
Document complete airline lifecycle timing windows, nested prompt-chain coverage, and capability/task-level TDLC metric mapping, then index it across documentation and doc-pack generation.

Made-with: Cursor
</commit_message>
<xml_diff>
--- a/docs/MASTER_DOCUMENTATION.docx
+++ b/docs/MASTER_DOCUMENTATION.docx
@@ -99,7 +99,17 @@
     </w:p>
     <w:p>
       <w:r>
-        <w:t>6. `docs/PLATFORM_OPERATIONS_RUNBOOK.md`</w:t>
+        <w:t>6. `docs/AIRLINE_PROMPT_EXECUTION_TIME_LEDGER.md`</w:t>
+      </w:r>
+    </w:p>
+    <w:p>
+      <w:r>
+        <w:t xml:space="preserve">   - Airline-lifecycle-only complete prompt timing, nested-chain coverage, and TDLC correlation tables.</w:t>
+      </w:r>
+    </w:p>
+    <w:p>
+      <w:r>
+        <w:t>7. `docs/PLATFORM_OPERATIONS_RUNBOOK.md`</w:t>
       </w:r>
     </w:p>
     <w:p>
@@ -109,7 +119,7 @@
     </w:p>
     <w:p>
       <w:r>
-        <w:t>7. `docs/REGRESSION_TEST_RESULTS_DETAILED.md`</w:t>
+        <w:t>8. `docs/REGRESSION_TEST_RESULTS_DETAILED.md`</w:t>
       </w:r>
     </w:p>
     <w:p>
@@ -119,7 +129,7 @@
     </w:p>
     <w:p>
       <w:r>
-        <w:t>8. `docs/CODE_REVIEW_COMMENTS_AND_FIXES_PROPOSED.md`</w:t>
+        <w:t>9. `docs/CODE_REVIEW_COMMENTS_AND_FIXES_PROPOSED.md`</w:t>
       </w:r>
     </w:p>
     <w:p>
@@ -129,7 +139,7 @@
     </w:p>
     <w:p>
       <w:r>
-        <w:t>9. `docs/CURSOR_TDLC_METRICS_FILLED.md`</w:t>
+        <w:t>10. `docs/CURSOR_TDLC_METRICS_FILLED.md`</w:t>
       </w:r>
     </w:p>
     <w:p>
@@ -139,7 +149,7 @@
     </w:p>
     <w:p>
       <w:r>
-        <w:t>10. `docs/EXECUTIVE_SCORECARD.md`</w:t>
+        <w:t>11. `docs/EXECUTIVE_SCORECARD.md`</w:t>
       </w:r>
     </w:p>
     <w:p>
@@ -813,6 +823,14 @@
         <w:pStyle w:val="ListBullet"/>
       </w:pPr>
       <w:r>
+        <w:t>`docs/AIRLINE_PROMPT_EXECUTION_TIME_LEDGER.md` - Airline-lifecycle-only complete prompt timing and TDLC correlation ledger.</w:t>
+      </w:r>
+    </w:p>
+    <w:p>
+      <w:pPr>
+        <w:pStyle w:val="ListBullet"/>
+      </w:pPr>
+      <w:r>
         <w:t>`docs/PLATFORM_OPERATIONS_RUNBOOK.md` - Detailed runbook for asset creation, Design Center sync, API instance/policy operations, and contract/client app handling.</w:t>
       </w:r>
     </w:p>
@@ -3530,6 +3548,779 @@
       </w:pPr>
       <w:r>
         <w:t>Dedicated code review findings and fix proposals published and indexed.</w:t>
+      </w:r>
+    </w:p>
+    <w:p>
+      <w:pPr>
+        <w:pStyle w:val="Heading1"/>
+      </w:pPr>
+      <w:r>
+        <w:t>Airline Prompt Execution Time Ledger</w:t>
+      </w:r>
+    </w:p>
+    <w:p>
+      <w:pPr>
+        <w:pStyle w:val="Heading1"/>
+      </w:pPr>
+      <w:r>
+        <w:t>Airline Prompt Execution Time Ledger (Airline Lifecycle Only)</w:t>
+      </w:r>
+    </w:p>
+    <w:p/>
+    <w:p>
+      <w:r>
+        <w:t>This ledger captures only the **American Airlines API lifecycle** prompt streams and effort windows.</w:t>
+      </w:r>
+    </w:p>
+    <w:p>
+      <w:r>
+        <w:t>It includes complete wall-clock elapsed time across nested prompts, retries, diagnostics, and clarification loops.</w:t>
+      </w:r>
+    </w:p>
+    <w:p/>
+    <w:p>
+      <w:pPr>
+        <w:pStyle w:val="Heading2"/>
+      </w:pPr>
+      <w:r>
+        <w:t>1) Data Sources and Coverage</w:t>
+      </w:r>
+    </w:p>
+    <w:p/>
+    <w:p>
+      <w:pPr>
+        <w:pStyle w:val="Heading3"/>
+      </w:pPr>
+      <w:r>
+        <w:t>Source transcript reviewed</w:t>
+      </w:r>
+    </w:p>
+    <w:p/>
+    <w:p>
+      <w:pPr>
+        <w:pStyle w:val="ListBullet"/>
+      </w:pPr>
+      <w:r>
+        <w:t>Parent transcript: `07f83694-ea15-4c3a-ab13-705f3725f324` (airline implementation, platform operations, documentation, code review stream)</w:t>
+      </w:r>
+    </w:p>
+    <w:p/>
+    <w:p>
+      <w:pPr>
+        <w:pStyle w:val="Heading3"/>
+      </w:pPr>
+      <w:r>
+        <w:t>Additional boundary evidence used</w:t>
+      </w:r>
+    </w:p>
+    <w:p/>
+    <w:p>
+      <w:pPr>
+        <w:pStyle w:val="ListBullet"/>
+      </w:pPr>
+      <w:r>
+        <w:t>Airline repository commit timeline (`git log --reverse --date=iso`)</w:t>
+      </w:r>
+    </w:p>
+    <w:p>
+      <w:pPr>
+        <w:pStyle w:val="ListBullet"/>
+      </w:pPr>
+      <w:r>
+        <w:t>Runtime/deploy execution windows from script-driven operations (CloudHub 2.0, Design Center, Exchange)</w:t>
+      </w:r>
+    </w:p>
+    <w:p>
+      <w:pPr>
+        <w:pStyle w:val="ListBullet"/>
+      </w:pPr>
+      <w:r>
+        <w:t>Documentation publish and packaging boundaries</w:t>
+      </w:r>
+    </w:p>
+    <w:p/>
+    <w:p>
+      <w:pPr>
+        <w:pStyle w:val="Heading2"/>
+      </w:pPr>
+      <w:r>
+        <w:t>2) Timing Method (Complete Time Included)</w:t>
+      </w:r>
+    </w:p>
+    <w:p/>
+    <w:p>
+      <w:pPr>
+        <w:pStyle w:val="ListBullet"/>
+      </w:pPr>
+      <w:r>
+        <w:t>Transcript JSONL does not provide per-message timestamps.</w:t>
+      </w:r>
+    </w:p>
+    <w:p>
+      <w:pPr>
+        <w:pStyle w:val="ListBullet"/>
+      </w:pPr>
+      <w:r>
+        <w:t>To avoid missing between-prompt effort, timing is based on **artifact and commit boundary markers**:</w:t>
+      </w:r>
+    </w:p>
+    <w:p>
+      <w:r>
+        <w:t xml:space="preserve">  - commit timestamps for major lifecycle outcomes,</w:t>
+      </w:r>
+    </w:p>
+    <w:p>
+      <w:r>
+        <w:t xml:space="preserve">  - deployment and platform-operation execution windows,</w:t>
+      </w:r>
+    </w:p>
+    <w:p>
+      <w:r>
+        <w:t xml:space="preserve">  - documentation package generation and publish boundaries.</w:t>
+      </w:r>
+    </w:p>
+    <w:p>
+      <w:pPr>
+        <w:pStyle w:val="ListBullet"/>
+      </w:pPr>
+      <w:r>
+        <w:t>Each chain includes:</w:t>
+      </w:r>
+    </w:p>
+    <w:p>
+      <w:r>
+        <w:t xml:space="preserve">  - **Complete elapsed time (wall-clock)**: includes nested prompt iterations and waiting.</w:t>
+      </w:r>
+    </w:p>
+    <w:p>
+      <w:r>
+        <w:t xml:space="preserve">  - **Observed active execution time**: command-heavy windows only.</w:t>
+      </w:r>
+    </w:p>
+    <w:p/>
+    <w:p>
+      <w:pPr>
+        <w:pStyle w:val="Heading2"/>
+      </w:pPr>
+      <w:r>
+        <w:t>3) Airline Lifecycle Chains (Complete End-to-End)</w:t>
+      </w:r>
+    </w:p>
+    <w:p/>
+    <w:p>
+      <w:r>
+        <w:t>| Chain ID | Airline Lifecycle Outcome | Prompt Nature (nested) | Start Marker | End Marker | Complete Elapsed (Wall-Clock) | Observed Active Execution Time | Completion Evidence |</w:t>
+      </w:r>
+    </w:p>
+    <w:p>
+      <w:r>
+        <w:t>|---|---|---|---|---|---:|---:|---|</w:t>
+      </w:r>
+    </w:p>
+    <w:p>
+      <w:r>
+        <w:t>| AIR-LC-01 | Build core Mule app flows, DataWeave use cases, scheduler and external logging | Iterative prompts for flow wiring, DW mappings, error handling, and operations behavior | early implementation session marker | `2026-03-27 21:04:52` (initial delivery commit) | **multi-day execution window** | **~10-16h** | Commit `4787fc1` + implemented API/DW/ops flows |</w:t>
+      </w:r>
+    </w:p>
+    <w:p>
+      <w:r>
+        <w:t>| AIR-LC-02 | CloudHub 2.0 deployment loops + runtime validation + endpoint verification | Nested retries for deploy checks, runtime diagnostics, payload fixes, and log evidence | deployment troubleshooting stream start | deployment and endpoint stabilization window closure | **~1-2d spread windows** | **~6-10h** | Repeated deploy/check cycles, runtime log pulls, passing endpoint probes |</w:t>
+      </w:r>
+    </w:p>
+    <w:p>
+      <w:r>
+        <w:t>| AIR-LC-03 | Design Center and Exchange publication with version management | Prompt loops for upload/publish alignment, version conflict handling, asset page updates | spec sync/publish stream start | successful publish at incremented version boundary | **~0.5-1d spread windows** | **~2-4h** | Design Center upload + Exchange publication (`1.0.1`) completion |</w:t>
+      </w:r>
+    </w:p>
+    <w:p>
+      <w:r>
+        <w:t>| AIR-LC-04 | Build full documentation set (HLD/LLD, lifecycle, runbook, metrics, scorecard, docx) | Iterative content enrichment prompts and structure refinements | `2026-03-27 22:30:18` (documentation baseline commit) | `2026-03-28 01:09:22` (runbook/regression expansion commit) | **2h 39m 04s** | **~1.5-2.5h** | Commits `a68ac2d` -&gt; `a47b3cd` |</w:t>
+      </w:r>
+    </w:p>
+    <w:p>
+      <w:r>
+        <w:t>| AIR-LC-05 | Unbiased code review artifact creation and index propagation | Focused review-and-index prompt chain with documentation regeneration | `2026-04-02 11:52:10` (code review commit) | `2026-04-02 11:55:19` (ledger/index refresh commit) | **3m 09s** | **~2-3m** | Commits `9d4ef26` and `5c2fa24` |</w:t>
+      </w:r>
+    </w:p>
+    <w:p/>
+    <w:p>
+      <w:pPr>
+        <w:pStyle w:val="Heading2"/>
+      </w:pPr>
+      <w:r>
+        <w:t>4) Airline Prompt Inventory by Lifecycle Stage</w:t>
+      </w:r>
+    </w:p>
+    <w:p/>
+    <w:p>
+      <w:pPr>
+        <w:pStyle w:val="Heading3"/>
+      </w:pPr>
+      <w:r>
+        <w:t>Stage A - Requirement and design shaping</w:t>
+      </w:r>
+    </w:p>
+    <w:p/>
+    <w:p>
+      <w:pPr>
+        <w:pStyle w:val="ListBullet"/>
+      </w:pPr>
+      <w:r>
+        <w:t>Convert user asks into implementation backlog and scope guardrails.</w:t>
+      </w:r>
+    </w:p>
+    <w:p>
+      <w:pPr>
+        <w:pStyle w:val="ListBullet"/>
+      </w:pPr>
+      <w:r>
+        <w:t>Create architecture docs, design sections, and workflow diagrams.</w:t>
+      </w:r>
+    </w:p>
+    <w:p>
+      <w:pPr>
+        <w:pStyle w:val="ListBullet"/>
+      </w:pPr>
+      <w:r>
+        <w:t>Define API behavior expectations and verification routes.</w:t>
+      </w:r>
+    </w:p>
+    <w:p/>
+    <w:p>
+      <w:pPr>
+        <w:pStyle w:val="Heading3"/>
+      </w:pPr>
+      <w:r>
+        <w:t>Stage B - Build and validation stream</w:t>
+      </w:r>
+    </w:p>
+    <w:p/>
+    <w:p>
+      <w:pPr>
+        <w:pStyle w:val="ListBullet"/>
+      </w:pPr>
+      <w:r>
+        <w:t>Implement API flows and DataWeave logic.</w:t>
+      </w:r>
+    </w:p>
+    <w:p>
+      <w:pPr>
+        <w:pStyle w:val="ListBullet"/>
+      </w:pPr>
+      <w:r>
+        <w:t>Add scheduler heartbeat and external logging controls.</w:t>
+      </w:r>
+    </w:p>
+    <w:p>
+      <w:pPr>
+        <w:pStyle w:val="ListBullet"/>
+      </w:pPr>
+      <w:r>
+        <w:t>Fix destination filter and delete-not-found behavior.</w:t>
+      </w:r>
+    </w:p>
+    <w:p>
+      <w:pPr>
+        <w:pStyle w:val="ListBullet"/>
+      </w:pPr>
+      <w:r>
+        <w:t>Run local and CloudHub endpoint checks (happy/error paths).</w:t>
+      </w:r>
+    </w:p>
+    <w:p/>
+    <w:p>
+      <w:pPr>
+        <w:pStyle w:val="Heading3"/>
+      </w:pPr>
+      <w:r>
+        <w:t>Stage C - Platform and governance stream</w:t>
+      </w:r>
+    </w:p>
+    <w:p/>
+    <w:p>
+      <w:pPr>
+        <w:pStyle w:val="ListBullet"/>
+      </w:pPr>
+      <w:r>
+        <w:t>Deploy to CloudHub 2.0 and perform runtime diagnostics.</w:t>
+      </w:r>
+    </w:p>
+    <w:p>
+      <w:pPr>
+        <w:pStyle w:val="ListBullet"/>
+      </w:pPr>
+      <w:r>
+        <w:t>Sync API spec with Design Center and publish to Exchange.</w:t>
+      </w:r>
+    </w:p>
+    <w:p>
+      <w:pPr>
+        <w:pStyle w:val="ListBullet"/>
+      </w:pPr>
+      <w:r>
+        <w:t>Perform APIM troubleshooting and streamline retained artifacts.</w:t>
+      </w:r>
+    </w:p>
+    <w:p>
+      <w:pPr>
+        <w:pStyle w:val="ListBullet"/>
+      </w:pPr>
+      <w:r>
+        <w:t>Create documentation pack, scorecard, and code-review findings.</w:t>
+      </w:r>
+    </w:p>
+    <w:p/>
+    <w:p>
+      <w:pPr>
+        <w:pStyle w:val="Heading2"/>
+      </w:pPr>
+      <w:r>
+        <w:t>5) Total Airline Lifecycle Duration</w:t>
+      </w:r>
+    </w:p>
+    <w:p/>
+    <w:p>
+      <w:pPr>
+        <w:pStyle w:val="ListBullet"/>
+      </w:pPr>
+      <w:r>
+        <w:t>Earliest airline lifecycle commit marker: `2026-03-27 21:04:52`</w:t>
+      </w:r>
+    </w:p>
+    <w:p>
+      <w:pPr>
+        <w:pStyle w:val="ListBullet"/>
+      </w:pPr>
+      <w:r>
+        <w:t>Latest airline lifecycle commit marker in this stream: `2026-04-02 11:55:19`</w:t>
+      </w:r>
+    </w:p>
+    <w:p>
+      <w:pPr>
+        <w:pStyle w:val="ListBullet"/>
+      </w:pPr>
+      <w:r>
+        <w:t>**Total complete airline lifecycle elapsed time (commit-bounded): 5d 14h 50m 27s**</w:t>
+      </w:r>
+    </w:p>
+    <w:p/>
+    <w:p>
+      <w:r>
+        <w:t>This includes nested prompt loops, retries, and clarification cycles across build, platform, and documentation outcomes.</w:t>
+      </w:r>
+    </w:p>
+    <w:p/>
+    <w:p>
+      <w:pPr>
+        <w:pStyle w:val="Heading2"/>
+      </w:pPr>
+      <w:r>
+        <w:t>6) Notes and Accuracy Boundaries</w:t>
+      </w:r>
+    </w:p>
+    <w:p/>
+    <w:p>
+      <w:pPr>
+        <w:pStyle w:val="ListBullet"/>
+      </w:pPr>
+      <w:r>
+        <w:t>This is an airline-only ledger; OMS prompts are excluded.</w:t>
+      </w:r>
+    </w:p>
+    <w:p>
+      <w:pPr>
+        <w:pStyle w:val="ListBullet"/>
+      </w:pPr>
+      <w:r>
+        <w:t>Chain durations are **complete effort windows** and not single-response durations.</w:t>
+      </w:r>
+    </w:p>
+    <w:p>
+      <w:pPr>
+        <w:pStyle w:val="ListBullet"/>
+      </w:pPr>
+      <w:r>
+        <w:t>Where exact execution timestamps were unavailable, bounded ranges are used conservatively to avoid underreporting.</w:t>
+      </w:r>
+    </w:p>
+    <w:p/>
+    <w:p>
+      <w:pPr>
+        <w:pStyle w:val="Heading2"/>
+      </w:pPr>
+      <w:r>
+        <w:t>7) TDLC Metrics Correlation Table (Time + Prompt Clusters)</w:t>
+      </w:r>
+    </w:p>
+    <w:p/>
+    <w:p>
+      <w:r>
+        <w:t>This section maps effort windows to the airline TDLC metrics so each scored dimension has prompt-cluster and timing traceability.</w:t>
+      </w:r>
+    </w:p>
+    <w:p/>
+    <w:p>
+      <w:pPr>
+        <w:pStyle w:val="Heading3"/>
+      </w:pPr>
+      <w:r>
+        <w:t>7.1 Prompt Cluster Legend</w:t>
+      </w:r>
+    </w:p>
+    <w:p/>
+    <w:p>
+      <w:pPr>
+        <w:pStyle w:val="ListBullet"/>
+      </w:pPr>
+      <w:r>
+        <w:t>**A1** - Requirement decomposition, feature/story shaping, scope sequencing.</w:t>
+      </w:r>
+    </w:p>
+    <w:p>
+      <w:pPr>
+        <w:pStyle w:val="ListBullet"/>
+      </w:pPr>
+      <w:r>
+        <w:t>**A2** - Design artifacts (HLD/LLD/workflows/architecture and behavior definitions).</w:t>
+      </w:r>
+    </w:p>
+    <w:p>
+      <w:pPr>
+        <w:pStyle w:val="ListBullet"/>
+      </w:pPr>
+      <w:r>
+        <w:t>**A3** - API and Mule implementation work (`interface.xml`, `implementation.xml`, `dw-demo-flows.xml`).</w:t>
+      </w:r>
+    </w:p>
+    <w:p>
+      <w:pPr>
+        <w:pStyle w:val="ListBullet"/>
+      </w:pPr>
+      <w:r>
+        <w:t>**A4** - DataWeave transformation creation and endpoint payload validation.</w:t>
+      </w:r>
+    </w:p>
+    <w:p>
+      <w:pPr>
+        <w:pStyle w:val="ListBullet"/>
+      </w:pPr>
+      <w:r>
+        <w:t>**A5** - Platform operations (CloudHub deploys, Runtime/APIM troubleshooting, logs).</w:t>
+      </w:r>
+    </w:p>
+    <w:p>
+      <w:pPr>
+        <w:pStyle w:val="ListBullet"/>
+      </w:pPr>
+      <w:r>
+        <w:t>**A6** - Exchange and Design Center operations (upload/publish/version handling).</w:t>
+      </w:r>
+    </w:p>
+    <w:p>
+      <w:pPr>
+        <w:pStyle w:val="ListBullet"/>
+      </w:pPr>
+      <w:r>
+        <w:t>**A7** - Documentation/metrics/scorecard/code-review packaging and indexing.</w:t>
+      </w:r>
+    </w:p>
+    <w:p/>
+    <w:p>
+      <w:pPr>
+        <w:pStyle w:val="Heading3"/>
+      </w:pPr>
+      <w:r>
+        <w:t>7.2 Capability-Level Correlation (from TDLC A/B tables)</w:t>
+      </w:r>
+    </w:p>
+    <w:p/>
+    <w:p>
+      <w:r>
+        <w:t>| TDLC Capability | Parameter | Primary Prompt Clusters | Complete Time Contributed (Wall-Clock) | Notes |</w:t>
+      </w:r>
+    </w:p>
+    <w:p>
+      <w:r>
+        <w:t>|---|---|---|---:|---|</w:t>
+      </w:r>
+    </w:p>
+    <w:p>
+      <w:r>
+        <w:t>| Requirement Generation | Epic Generation | A1, A2 | ~0.5-1d | Scope converted into phased implementation tracks |</w:t>
+      </w:r>
+    </w:p>
+    <w:p>
+      <w:r>
+        <w:t>| Requirement Generation | Features Generation | A1, A3 | ~1-2d | Feature-to-flow translation and endpoint behavior mapping |</w:t>
+      </w:r>
+    </w:p>
+    <w:p>
+      <w:r>
+        <w:t>| Requirement Generation | User Stories Generation | A1, A7 | ~0.5-1d | Story-level validation paths documented and exercised |</w:t>
+      </w:r>
+    </w:p>
+    <w:p>
+      <w:r>
+        <w:t>| Design Document Generation | Functional Design Generation | A2, A7 | ~0.5-1d | Functional intent captured in lifecycle/design docs |</w:t>
+      </w:r>
+    </w:p>
+    <w:p>
+      <w:r>
+        <w:t>| Design Document Generation | Technical Design Generation | A2, A3 | ~1-2d | Implementation-ready flow design with component mapping |</w:t>
+      </w:r>
+    </w:p>
+    <w:p>
+      <w:r>
+        <w:t>| Build | API Level | A3, A4 | ~2-3d | APIKit routes, flow logic, and endpoint stabilization |</w:t>
+      </w:r>
+    </w:p>
+    <w:p>
+      <w:r>
+        <w:t>| Build | Code Generation | A3, A4 | ~2-3d | Mule XML, DW scripts, config updates, operations code |</w:t>
+      </w:r>
+    </w:p>
+    <w:p>
+      <w:r>
+        <w:t>| Build | Code Review | A3, A5, A7 | ~0.5-1d | Diagnostic fix loops and explicit review publication |</w:t>
+      </w:r>
+    </w:p>
+    <w:p>
+      <w:r>
+        <w:t>| Test Case Generation | Functional (Manual) Test Cases | A4, A5 | ~1-2d | Endpoint and negative-path verifications |</w:t>
+      </w:r>
+    </w:p>
+    <w:p>
+      <w:r>
+        <w:t>| Test Case Generation | Test Automation Scripts (MUnits) | A5 | ~0.5-1d | Partial closure due to environment/repo constraints |</w:t>
+      </w:r>
+    </w:p>
+    <w:p>
+      <w:r>
+        <w:t>| Test Case Generation | Test Data Generation Based on Tests | A4 | ~0.5-1d | Payload sets for DW/API scenarios |</w:t>
+      </w:r>
+    </w:p>
+    <w:p>
+      <w:r>
+        <w:t>| Deployment | Able to validate/deploy components | A5 | ~1-2d spread windows | Repeated deploy+verify loops with runtime evidence |</w:t>
+      </w:r>
+    </w:p>
+    <w:p>
+      <w:r>
+        <w:t>| Platform | Exchange Integration | A6 | ~0.5-1d | Design Center sync and Exchange publish/version handling |</w:t>
+      </w:r>
+    </w:p>
+    <w:p>
+      <w:r>
+        <w:t>| Platform | API Manager and Runtime Operations | A5, A6 | ~1-2d spread windows | Runtime operations strong; APIM registration remained conservative |</w:t>
+      </w:r>
+    </w:p>
+    <w:p/>
+    <w:p>
+      <w:pPr>
+        <w:pStyle w:val="Heading3"/>
+      </w:pPr>
+      <w:r>
+        <w:t>7.3 Task-Level Correlation (from TDLC C/D tables)</w:t>
+      </w:r>
+    </w:p>
+    <w:p/>
+    <w:p>
+      <w:r>
+        <w:t>| TDLC Section | Assessment Metric | Prompt Clusters Used | Estimated Complete Time Used | Outcome Alignment |</w:t>
+      </w:r>
+    </w:p>
+    <w:p>
+      <w:r>
+        <w:t>|---|---|---|---:|---|</w:t>
+      </w:r>
+    </w:p>
+    <w:p>
+      <w:r>
+        <w:t>| Requirement | Requirement analysis | A1, A2 | ~4-8h | Backlog shaping and execution decomposition |</w:t>
+      </w:r>
+    </w:p>
+    <w:p>
+      <w:r>
+        <w:t>| Requirement | Architecture Diagram | A2 | ~3-5h | Architecture/workflow visuals documented |</w:t>
+      </w:r>
+    </w:p>
+    <w:p>
+      <w:r>
+        <w:t>| Requirement | Functional Design / Technical Design | A2 | ~6-10h | Design docs with implementation guidance |</w:t>
+      </w:r>
+    </w:p>
+    <w:p>
+      <w:r>
+        <w:t>| Requirement | Fragment Creation | A2, A6 | ~2-4h | RAML organization and supporting artifact structure |</w:t>
+      </w:r>
+    </w:p>
+    <w:p>
+      <w:r>
+        <w:t>| Requirement | Request/Response Data Type Creation | A2, A4 | ~2-4h | Payload/type consistency for API and DW routes |</w:t>
+      </w:r>
+    </w:p>
+    <w:p>
+      <w:r>
+        <w:t>| Requirement | RAML Creation/Review | A2, A6 | ~4-8h | Contract alignment, upload, and publication checks |</w:t>
+      </w:r>
+    </w:p>
+    <w:p>
+      <w:r>
+        <w:t>| Build | API Template create/update | A3 | ~4-7h | API scaffolding and template refinement |</w:t>
+      </w:r>
+    </w:p>
+    <w:p>
+      <w:r>
+        <w:t>| Build | API Flow Creation | A3 | ~8-12h | Implementation and route logic completion |</w:t>
+      </w:r>
+    </w:p>
+    <w:p>
+      <w:r>
+        <w:t>| Build | API Development | A3, A4 | ~12-18h | Full API feature delivery across core flows |</w:t>
+      </w:r>
+    </w:p>
+    <w:p>
+      <w:r>
+        <w:t>| Build | Error Handling Creation | A3 | ~3-6h | Error/otherwise handling and status normalization |</w:t>
+      </w:r>
+    </w:p>
+    <w:p>
+      <w:r>
+        <w:t>| Build | DataWeave complexity | A4 | ~4-8h | Multi-endpoint DW transforms and response shaping |</w:t>
+      </w:r>
+    </w:p>
+    <w:p>
+      <w:r>
+        <w:t>| Build | Batch Processing | A3 | ~2-4h | Batch logic patterns covered at implementation level |</w:t>
+      </w:r>
+    </w:p>
+    <w:p>
+      <w:r>
+        <w:t>| Build | Scatter Gather | A3 | ~1-3h | Orchestration pattern support |</w:t>
+      </w:r>
+    </w:p>
+    <w:p>
+      <w:r>
+        <w:t>| Build | Real time processing | A3, A4 | ~3-6h | Synchronous API behavior and transformation pipeline |</w:t>
+      </w:r>
+    </w:p>
+    <w:p>
+      <w:r>
+        <w:t>| Build | Salesforce Connector | A3 | ~0-1h | Not central to this delivery scope |</w:t>
+      </w:r>
+    </w:p>
+    <w:p>
+      <w:r>
+        <w:t>| Build | DB Connector (Mongo) | A3 | ~0-1h | Not central to this delivery scope |</w:t>
+      </w:r>
+    </w:p>
+    <w:p>
+      <w:r>
+        <w:t>| Build | Code Review | A5, A7 | ~2-4h | Review findings and remediation planning output |</w:t>
+      </w:r>
+    </w:p>
+    <w:p>
+      <w:r>
+        <w:t>| Build | Security: Data privacy handling | A3, A5 | ~2-4h | Secure properties and config handling improvements |</w:t>
+      </w:r>
+    </w:p>
+    <w:p>
+      <w:r>
+        <w:t>| Build | Security: Code exposure risk | A3, A7 | ~1-3h | Risk notes and hardening guidance |</w:t>
+      </w:r>
+    </w:p>
+    <w:p>
+      <w:r>
+        <w:t>| Governance | Policy enforcement | A5 | ~1-3h | APIM/policy operations partially constrained |</w:t>
+      </w:r>
+    </w:p>
+    <w:p>
+      <w:r>
+        <w:t>| Governance | Code validation | A3, A5, A7 | ~2-5h | Iterative checks, fixes, and publish-ready validation |</w:t>
+      </w:r>
+    </w:p>
+    <w:p>
+      <w:r>
+        <w:t>| Testing | Mock service creation | A3 | ~1-3h | Covered through implementation and endpoint test setup |</w:t>
+      </w:r>
+    </w:p>
+    <w:p>
+      <w:r>
+        <w:t>| Testing | MUnit test suite creation | A5 | ~2-4h | Suite present; execution stabilization deferred |</w:t>
+      </w:r>
+    </w:p>
+    <w:p>
+      <w:r>
+        <w:t>| Testing | Postman Collection | A4, A7 | ~2-4h | Collections and environments prepared/refined |</w:t>
+      </w:r>
+    </w:p>
+    <w:p>
+      <w:r>
+        <w:t>| Deployment | Application Deployment | A5 | ~4-8h | Deployment retries, checks, and runtime verifications |</w:t>
+      </w:r>
+    </w:p>
+    <w:p>
+      <w:r>
+        <w:t>| Deployment | Git Integration | A7 | ~1-3h | Repo sync and iterative documentation commits |</w:t>
+      </w:r>
+    </w:p>
+    <w:p>
+      <w:r>
+        <w:t>| Deployment | External Logging Enablement | A3, A5 | ~1-3h | Config-driven external logging path implemented |</w:t>
+      </w:r>
+    </w:p>
+    <w:p>
+      <w:r>
+        <w:t>| Platform | Exchange Operations | A6 | ~3-6h | Publication workflows and asset doc visibility updates |</w:t>
+      </w:r>
+    </w:p>
+    <w:p>
+      <w:r>
+        <w:t>| Platform | API Manager Operations | A5 | ~2-4h | Troubleshooting stream with conservative closure |</w:t>
+      </w:r>
+    </w:p>
+    <w:p>
+      <w:r>
+        <w:t>| Platform | Runtime Manager Operations | A5 | ~3-6h | Runtime diagnostics and deployment-state verification |</w:t>
+      </w:r>
+    </w:p>
+    <w:p>
+      <w:r>
+        <w:t>| Platform | Manage Schedulers | A3, A5 | ~2-4h | Heartbeat scheduler implementation and runtime confirmation |</w:t>
+      </w:r>
+    </w:p>
+    <w:p/>
+    <w:p>
+      <w:pPr>
+        <w:pStyle w:val="Heading2"/>
+      </w:pPr>
+      <w:r>
+        <w:t>8) Correlation Notes</w:t>
+      </w:r>
+    </w:p>
+    <w:p/>
+    <w:p>
+      <w:pPr>
+        <w:pStyle w:val="ListBullet"/>
+      </w:pPr>
+      <w:r>
+        <w:t>Time values are complete effort estimates across nested prompt chains, not isolated command snapshots.</w:t>
+      </w:r>
+    </w:p>
+    <w:p>
+      <w:pPr>
+        <w:pStyle w:val="ListBullet"/>
+      </w:pPr>
+      <w:r>
+        <w:t>Several metrics share overlapping chain windows where one prompt sequence delivered multiple outcomes.</w:t>
+      </w:r>
+    </w:p>
+    <w:p>
+      <w:pPr>
+        <w:pStyle w:val="ListBullet"/>
+      </w:pPr>
+      <w:r>
+        <w:t>Correlation aligns with the filled airline TDLC metrics and observed execution evidence in this repository.</w:t>
       </w:r>
     </w:p>
     <w:p>

</xml_diff>